<commit_message>
Migrate data layer to Cloud Firestore; add Firebase setup, manual & updated docs
- Replace shared_preferences with firebase_core + cloud_firestore
- Add lib/firebase_options.dart (web) for the shared Firebase project
- Realtime snapshot listener for transactions; budget in settings/app
- Update tests to use fake_cloud_firestore (12 passing)
- Update README, project report and slides to reflect Firebase
- Add docs/USER_MANUAL.md (setup & demo guide for the team)
</commit_message>
<xml_diff>
--- a/docs/My_Wallet_Project_Report.docx
+++ b/docs/My_Wallet_Project_Report.docx
@@ -2,134 +2,1358 @@
 <file path=word/document.xml><?xml version="1.0" encoding="utf-8"?>
 <w:document xmlns:wpc="http://schemas.microsoft.com/office/word/2010/wordprocessingCanvas" xmlns:mo="http://schemas.microsoft.com/office/mac/office/2008/main" xmlns:mc="http://schemas.openxmlformats.org/markup-compatibility/2006" xmlns:mv="urn:schemas-microsoft-com:mac:vml" xmlns:o="urn:schemas-microsoft-com:office:office" xmlns:r="http://schemas.openxmlformats.org/officeDocument/2006/relationships" xmlns:m="http://schemas.openxmlformats.org/officeDocument/2006/math" xmlns:v="urn:schemas-microsoft-com:vml" xmlns:wp14="http://schemas.microsoft.com/office/word/2010/wordprocessingDrawing" xmlns:wp="http://schemas.openxmlformats.org/drawingml/2006/wordprocessingDrawing" xmlns:w10="urn:schemas-microsoft-com:office:word" xmlns:w="http://schemas.openxmlformats.org/wordprocessingml/2006/main" xmlns:w14="http://schemas.microsoft.com/office/word/2010/wordml" xmlns:wpg="http://schemas.microsoft.com/office/word/2010/wordprocessingGroup" xmlns:wpi="http://schemas.microsoft.com/office/word/2010/wordprocessingInk" xmlns:wne="http://schemas.microsoft.com/office/word/2006/wordml" xmlns:wps="http://schemas.microsoft.com/office/word/2010/wordprocessingShape" mc:Ignorable="w14 wp14">
   <w:body>
-    <w:p>
+    <w:p xmlns:a="http://schemas.openxmlformats.org/drawingml/2006/main" xmlns:pic="http://schemas.openxmlformats.org/drawingml/2006/picture">
       <w:pPr>
-        <w:spacing w:after="120" w:before="800"/>
-      </w:pPr>
-    </w:p>
-    <w:p>
-      <w:pPr>
-        <w:spacing w:after="80" w:before="0"/>
+        <w:spacing w:after="0" w:lineRule="auto"/>
         <w:jc w:val="center"/>
+        <w:rPr>
+          <w:rFonts w:ascii="Arial" w:cs="Arial" w:eastAsia="Arial" w:hAnsi="Arial"/>
+        </w:rPr>
       </w:pPr>
       <w:r>
         <w:rPr>
-          <w:b/>
-          <w:i w:val="0"/>
-          <w:color w:val="666666"/>
-          <w:sz w:val="24"/>
+          <w:rFonts w:ascii="Arial" w:cs="Arial" w:eastAsia="Arial" w:hAnsi="Arial"/>
         </w:rPr>
-        <w:t>MOBILE APPLICATION DEVELOPMENT</w:t>
+        <w:drawing>
+          <wp:inline distB="114300" distT="114300" distL="114300" distR="114300">
+            <wp:extent cx="4115162" cy="1878425"/>
+            <wp:effectExtent b="0" l="0" r="0" t="0"/>
+            <wp:docPr id="1" name="image1.png"/>
+            <a:graphic>
+              <a:graphicData uri="http://schemas.openxmlformats.org/drawingml/2006/picture">
+                <pic:pic>
+                  <pic:nvPicPr>
+                    <pic:cNvPr id="0" name="image1.png"/>
+                    <pic:cNvPicPr preferRelativeResize="0"/>
+                  </pic:nvPicPr>
+                  <pic:blipFill>
+                    <a:blip r:embed="rId10"/>
+                    <a:srcRect b="19999" l="0" r="0" t="15416"/>
+                    <a:stretch>
+                      <a:fillRect/>
+                    </a:stretch>
+                  </pic:blipFill>
+                  <pic:spPr>
+                    <a:xfrm>
+                      <a:off x="0" y="0"/>
+                      <a:ext cx="4115162" cy="1878425"/>
+                    </a:xfrm>
+                    <a:prstGeom prst="rect"/>
+                    <a:ln/>
+                  </pic:spPr>
+                </pic:pic>
+              </a:graphicData>
+            </a:graphic>
+          </wp:inline>
+        </w:drawing>
+      </w:r>
+      <w:r>
+        <w:rPr>
+          <w:rtl w:val="0"/>
+        </w:rPr>
       </w:r>
     </w:p>
     <w:p>
       <w:pPr>
-        <w:spacing w:after="800" w:before="0"/>
+        <w:spacing w:after="0" w:lineRule="auto"/>
         <w:jc w:val="center"/>
+        <w:rPr>
+          <w:rFonts w:ascii="Arial" w:cs="Arial" w:eastAsia="Arial" w:hAnsi="Arial"/>
+        </w:rPr>
       </w:pPr>
       <w:r>
         <w:rPr>
-          <w:b w:val="0"/>
-          <w:i/>
-          <w:color w:val="666666"/>
-          <w:sz w:val="24"/>
+          <w:rtl w:val="0"/>
         </w:rPr>
-        <w:t>Project Report</w:t>
       </w:r>
     </w:p>
     <w:p>
       <w:pPr>
-        <w:spacing w:after="40" w:before="0"/>
+        <w:spacing w:after="0" w:line="240" w:lineRule="auto"/>
         <w:jc w:val="center"/>
+        <w:rPr>
+          <w:rFonts w:ascii="Arial" w:cs="Arial" w:eastAsia="Arial" w:hAnsi="Arial"/>
+          <w:b w:val="1"/>
+          <w:bCs w:val="1"/>
+          <w:sz w:val="26"/>
+          <w:szCs w:val="26"/>
+        </w:rPr>
       </w:pPr>
+      <w:bookmarkStart w:colFirst="0" w:colLast="0" w:name="_5t96kcpcnja2" w:id="0"/>
+      <w:bookmarkEnd w:id="0"/>
       <w:r>
         <w:rPr>
-          <w:b/>
-          <w:color w:val="F5A600"/>
-          <w:sz w:val="80"/>
+          <w:rtl w:val="0"/>
         </w:rPr>
-        <w:t>My Wallet</w:t>
       </w:r>
     </w:p>
     <w:p>
       <w:pPr>
-        <w:spacing w:after="120" w:before="0"/>
+        <w:spacing w:after="0" w:line="240" w:lineRule="auto"/>
         <w:jc w:val="center"/>
+        <w:rPr>
+          <w:rFonts w:ascii="Arial" w:cs="Arial" w:eastAsia="Arial" w:hAnsi="Arial"/>
+          <w:b w:val="1"/>
+          <w:bCs w:val="1"/>
+          <w:sz w:val="26"/>
+          <w:szCs w:val="26"/>
+        </w:rPr>
       </w:pPr>
+      <w:bookmarkStart w:colFirst="0" w:colLast="0" w:name="_pnm6f8uwh88j" w:id="1"/>
+      <w:bookmarkEnd w:id="1"/>
       <w:r>
         <w:rPr>
-          <w:b/>
-          <w:i w:val="0"/>
-          <w:color w:val="222222"/>
-          <w:sz w:val="40"/>
+          <w:rFonts w:ascii="Arial" w:cs="Arial" w:eastAsia="Arial" w:hAnsi="Arial"/>
+          <w:b w:val="1"/>
+          <w:bCs w:val="1"/>
+          <w:sz w:val="26"/>
+          <w:szCs w:val="26"/>
+          <w:rtl w:val="0"/>
         </w:rPr>
-        <w:t>Personal Expense Tracker</w:t>
+        <w:t xml:space="preserve">DES3113</w:t>
       </w:r>
     </w:p>
     <w:p>
       <w:pPr>
-        <w:spacing w:after="600" w:before="0"/>
+        <w:spacing w:after="0" w:line="240" w:lineRule="auto"/>
         <w:jc w:val="center"/>
+        <w:rPr>
+          <w:rFonts w:ascii="Arial" w:cs="Arial" w:eastAsia="Arial" w:hAnsi="Arial"/>
+          <w:b w:val="1"/>
+          <w:bCs w:val="1"/>
+          <w:sz w:val="26"/>
+          <w:szCs w:val="26"/>
+        </w:rPr>
+      </w:pPr>
+      <w:bookmarkStart w:colFirst="0" w:colLast="0" w:name="_7wo2lpxnmuxo" w:id="2"/>
+      <w:bookmarkEnd w:id="2"/>
+      <w:r>
+        <w:rPr>
+          <w:rtl w:val="0"/>
+        </w:rPr>
+      </w:r>
+    </w:p>
+    <w:p>
+      <w:pPr>
+        <w:spacing w:after="0" w:line="240" w:lineRule="auto"/>
+        <w:jc w:val="left"/>
+        <w:rPr>
+          <w:rFonts w:ascii="Arial" w:cs="Arial" w:eastAsia="Arial" w:hAnsi="Arial"/>
+          <w:b w:val="1"/>
+          <w:bCs w:val="1"/>
+          <w:sz w:val="26"/>
+          <w:szCs w:val="26"/>
+        </w:rPr>
+      </w:pPr>
+      <w:bookmarkStart w:colFirst="0" w:colLast="0" w:name="_8174lkwvgjvq" w:id="3"/>
+      <w:bookmarkEnd w:id="3"/>
+      <w:r>
+        <w:rPr>
+          <w:rtl w:val="0"/>
+        </w:rPr>
+      </w:r>
+    </w:p>
+    <w:p>
+      <w:pPr>
+        <w:spacing w:after="0" w:line="240" w:lineRule="auto"/>
+        <w:jc w:val="center"/>
+        <w:rPr>
+          <w:rFonts w:ascii="Arial" w:cs="Arial" w:eastAsia="Arial" w:hAnsi="Arial"/>
+          <w:b w:val="1"/>
+          <w:bCs w:val="1"/>
+          <w:sz w:val="26"/>
+          <w:szCs w:val="26"/>
+        </w:rPr>
+      </w:pPr>
+      <w:bookmarkStart w:colFirst="0" w:colLast="0" w:name="_1c989yuzrbws" w:id="4"/>
+      <w:bookmarkEnd w:id="4"/>
+      <w:r>
+        <w:rPr>
+          <w:rFonts w:ascii="Arial" w:cs="Arial" w:eastAsia="Arial" w:hAnsi="Arial"/>
+          <w:b w:val="1"/>
+          <w:bCs w:val="1"/>
+          <w:sz w:val="26"/>
+          <w:szCs w:val="26"/>
+          <w:rtl w:val="0"/>
+        </w:rPr>
+        <w:t xml:space="preserve"> Reka Bentuk dan Pembangunan Aplikasi Mobil</w:t>
+      </w:r>
+    </w:p>
+    <w:p>
+      <w:pPr>
+        <w:spacing w:after="0" w:line="240" w:lineRule="auto"/>
+        <w:jc w:val="center"/>
+        <w:rPr>
+          <w:rFonts w:ascii="Arial" w:cs="Arial" w:eastAsia="Arial" w:hAnsi="Arial"/>
+          <w:b w:val="1"/>
+          <w:bCs w:val="1"/>
+          <w:sz w:val="28"/>
+          <w:szCs w:val="28"/>
+          <w:highlight w:val="black"/>
+        </w:rPr>
       </w:pPr>
       <w:r>
         <w:rPr>
-          <w:b w:val="0"/>
-          <w:i/>
-          <w:color w:val="666666"/>
+          <w:rtl w:val="0"/>
+        </w:rPr>
+      </w:r>
+    </w:p>
+    <w:p>
+      <w:pPr>
+        <w:spacing w:after="0" w:line="276" w:lineRule="auto"/>
+        <w:jc w:val="center"/>
+        <w:rPr>
+          <w:rFonts w:ascii="Arial" w:cs="Arial" w:eastAsia="Arial" w:hAnsi="Arial"/>
+          <w:b w:val="1"/>
+          <w:bCs w:val="1"/>
+          <w:sz w:val="26"/>
+          <w:szCs w:val="26"/>
+        </w:rPr>
+      </w:pPr>
+      <w:r>
+        <w:rPr>
+          <w:rtl w:val="0"/>
+        </w:rPr>
+      </w:r>
+    </w:p>
+    <w:p>
+      <w:pPr>
+        <w:spacing w:after="0" w:line="240" w:lineRule="auto"/>
+        <w:jc w:val="center"/>
+        <w:rPr>
+          <w:rFonts w:ascii="Arial" w:cs="Arial" w:eastAsia="Arial" w:hAnsi="Arial"/>
+          <w:b w:val="1"/>
+          <w:bCs w:val="1"/>
           <w:sz w:val="24"/>
+          <w:szCs w:val="24"/>
         </w:rPr>
-        <w:t>A Cross-Platform CRUD Mobile Application Built with Flutter</w:t>
+      </w:pPr>
+      <w:r>
+        <w:rPr>
+          <w:rtl w:val="0"/>
+        </w:rPr>
+      </w:r>
+    </w:p>
+    <w:p>
+      <w:pPr>
+        <w:spacing w:after="0" w:line="240" w:lineRule="auto"/>
+        <w:jc w:val="center"/>
+        <w:rPr>
+          <w:rFonts w:ascii="Arial" w:cs="Arial" w:eastAsia="Arial" w:hAnsi="Arial"/>
+          <w:b w:val="1"/>
+          <w:bCs w:val="1"/>
+          <w:sz w:val="24"/>
+          <w:szCs w:val="24"/>
+        </w:rPr>
+      </w:pPr>
+      <w:r>
+        <w:pict>
+          <v:rect style="width:0.0pt;height:1.5pt" o:hr="t" o:hrstd="t" o:hralign="center" fillcolor="#A0A0A0" stroked="f"/>
+        </w:pict>
+      </w:r>
+      <w:r>
+        <w:rPr>
+          <w:rtl w:val="0"/>
+        </w:rPr>
+      </w:r>
+    </w:p>
+    <w:p>
+      <w:pPr>
+        <w:spacing w:after="0" w:line="240" w:lineRule="auto"/>
+        <w:jc w:val="center"/>
+        <w:rPr>
+          <w:rFonts w:ascii="Arial" w:cs="Arial" w:eastAsia="Arial" w:hAnsi="Arial"/>
+          <w:b w:val="1"/>
+          <w:bCs w:val="1"/>
+          <w:sz w:val="6"/>
+          <w:szCs w:val="6"/>
+        </w:rPr>
+      </w:pPr>
+      <w:r>
+        <w:rPr>
+          <w:rtl w:val="0"/>
+        </w:rPr>
+      </w:r>
+    </w:p>
+    <w:p>
+      <w:pPr>
+        <w:spacing w:after="0" w:line="240" w:lineRule="auto"/>
+        <w:jc w:val="center"/>
+        <w:rPr>
+          <w:rFonts w:ascii="Arial" w:cs="Arial" w:eastAsia="Arial" w:hAnsi="Arial"/>
+          <w:b w:val="1"/>
+          <w:bCs w:val="1"/>
+          <w:sz w:val="26"/>
+          <w:szCs w:val="26"/>
+        </w:rPr>
+      </w:pPr>
+      <w:r>
+        <w:rPr>
+          <w:rtl w:val="0"/>
+        </w:rPr>
+      </w:r>
+    </w:p>
+    <w:p>
+      <w:pPr>
+        <w:spacing w:after="0" w:line="240" w:lineRule="auto"/>
+        <w:jc w:val="center"/>
+        <w:rPr>
+          <w:rFonts w:ascii="Arial" w:cs="Arial" w:eastAsia="Arial" w:hAnsi="Arial"/>
+          <w:b w:val="1"/>
+          <w:bCs w:val="1"/>
+          <w:sz w:val="26"/>
+          <w:szCs w:val="26"/>
+        </w:rPr>
+      </w:pPr>
+      <w:r>
+        <w:rPr>
+          <w:rFonts w:ascii="Arial" w:cs="Arial" w:eastAsia="Arial" w:hAnsi="Arial"/>
+          <w:b w:val="1"/>
+          <w:bCs w:val="1"/>
+          <w:sz w:val="26"/>
+          <w:szCs w:val="26"/>
+          <w:rtl w:val="0"/>
+        </w:rPr>
+        <w:t xml:space="preserve">TITTLE: My Wallet-Personal Expense Tracker</w:t>
+      </w:r>
+    </w:p>
+    <w:p>
+      <w:pPr>
+        <w:spacing w:after="0" w:line="240" w:lineRule="auto"/>
+        <w:jc w:val="center"/>
+        <w:rPr>
+          <w:rFonts w:ascii="Arial" w:cs="Arial" w:eastAsia="Arial" w:hAnsi="Arial"/>
+          <w:b w:val="1"/>
+          <w:bCs w:val="1"/>
+          <w:sz w:val="26"/>
+          <w:szCs w:val="26"/>
+        </w:rPr>
+      </w:pPr>
+      <w:r>
+        <w:rPr>
+          <w:rtl w:val="0"/>
+        </w:rPr>
+      </w:r>
+    </w:p>
+    <w:p>
+      <w:pPr>
+        <w:spacing w:after="0" w:line="240" w:lineRule="auto"/>
+        <w:jc w:val="center"/>
+        <w:rPr>
+          <w:rFonts w:ascii="Arial" w:cs="Arial" w:eastAsia="Arial" w:hAnsi="Arial"/>
+          <w:b w:val="1"/>
+          <w:bCs w:val="1"/>
+          <w:sz w:val="26"/>
+          <w:szCs w:val="26"/>
+        </w:rPr>
+      </w:pPr>
+      <w:r>
+        <w:rPr>
+          <w:rtl w:val="0"/>
+        </w:rPr>
+      </w:r>
+    </w:p>
+    <w:p>
+      <w:pPr>
+        <w:spacing w:after="0" w:line="240" w:lineRule="auto"/>
+        <w:jc w:val="center"/>
+        <w:rPr>
+          <w:rFonts w:ascii="Arial" w:cs="Arial" w:eastAsia="Arial" w:hAnsi="Arial"/>
+          <w:b w:val="1"/>
+          <w:bCs w:val="1"/>
+          <w:sz w:val="26"/>
+          <w:szCs w:val="26"/>
+        </w:rPr>
+      </w:pPr>
+      <w:r>
+        <w:rPr>
+          <w:rtl w:val="0"/>
+        </w:rPr>
+      </w:r>
+    </w:p>
+    <w:p>
+      <w:pPr>
+        <w:spacing w:after="0" w:line="240" w:lineRule="auto"/>
+        <w:jc w:val="center"/>
+        <w:rPr>
+          <w:rFonts w:ascii="Arial" w:cs="Arial" w:eastAsia="Arial" w:hAnsi="Arial"/>
+          <w:b w:val="1"/>
+          <w:bCs w:val="1"/>
+          <w:sz w:val="26"/>
+          <w:szCs w:val="26"/>
+        </w:rPr>
+      </w:pPr>
+      <w:r>
+        <w:rPr>
+          <w:rtl w:val="0"/>
+        </w:rPr>
+      </w:r>
+    </w:p>
+    <w:p>
+      <w:pPr>
+        <w:spacing w:after="0" w:line="240" w:lineRule="auto"/>
+        <w:rPr>
+          <w:rFonts w:ascii="Arial" w:cs="Arial" w:eastAsia="Arial" w:hAnsi="Arial"/>
+          <w:b w:val="1"/>
+          <w:bCs w:val="1"/>
+          <w:sz w:val="6"/>
+          <w:szCs w:val="6"/>
+        </w:rPr>
+      </w:pPr>
+      <w:r>
+        <w:rPr>
+          <w:rtl w:val="0"/>
+        </w:rPr>
+      </w:r>
+    </w:p>
+    <w:p>
+      <w:pPr>
+        <w:spacing w:after="0" w:line="240" w:lineRule="auto"/>
+        <w:jc w:val="center"/>
+        <w:rPr>
+          <w:rFonts w:ascii="Arial" w:cs="Arial" w:eastAsia="Arial" w:hAnsi="Arial"/>
+          <w:b w:val="1"/>
+          <w:bCs w:val="1"/>
+          <w:sz w:val="24"/>
+          <w:szCs w:val="24"/>
+        </w:rPr>
+      </w:pPr>
+      <w:r>
+        <w:pict>
+          <v:rect style="width:0.0pt;height:1.5pt" o:hr="t" o:hrstd="t" o:hralign="center" fillcolor="#A0A0A0" stroked="f"/>
+        </w:pict>
+      </w:r>
+      <w:r>
+        <w:rPr>
+          <w:rtl w:val="0"/>
+        </w:rPr>
+      </w:r>
+    </w:p>
+    <w:p>
+      <w:pPr>
+        <w:spacing w:after="0" w:line="276" w:lineRule="auto"/>
+        <w:jc w:val="center"/>
+        <w:rPr>
+          <w:rFonts w:ascii="Arial" w:cs="Arial" w:eastAsia="Arial" w:hAnsi="Arial"/>
+          <w:b w:val="1"/>
+          <w:bCs w:val="1"/>
+          <w:sz w:val="24"/>
+          <w:szCs w:val="24"/>
+        </w:rPr>
+      </w:pPr>
+      <w:r>
+        <w:rPr>
+          <w:rFonts w:ascii="Arial" w:cs="Arial" w:eastAsia="Arial" w:hAnsi="Arial"/>
+          <w:b w:val="1"/>
+          <w:bCs w:val="1"/>
+          <w:sz w:val="24"/>
+          <w:szCs w:val="24"/>
+          <w:rtl w:val="0"/>
+        </w:rPr>
+        <w:t xml:space="preserve">GROUP ASSIGNMENT </w:t>
+      </w:r>
+    </w:p>
+    <w:p>
+      <w:pPr>
+        <w:spacing w:after="0" w:line="276" w:lineRule="auto"/>
+        <w:jc w:val="center"/>
+        <w:rPr>
+          <w:rFonts w:ascii="Arial" w:cs="Arial" w:eastAsia="Arial" w:hAnsi="Arial"/>
+          <w:b w:val="1"/>
+          <w:bCs w:val="1"/>
+          <w:sz w:val="30"/>
+          <w:szCs w:val="30"/>
+        </w:rPr>
+      </w:pPr>
+      <w:r>
+        <w:rPr>
+          <w:rFonts w:ascii="Arial" w:cs="Arial" w:eastAsia="Arial" w:hAnsi="Arial"/>
+          <w:b w:val="1"/>
+          <w:bCs w:val="1"/>
+          <w:sz w:val="24"/>
+          <w:szCs w:val="24"/>
+          <w:rtl w:val="0"/>
+        </w:rPr>
+        <w:t xml:space="preserve"> </w:t>
+      </w:r>
+      <w:r>
+        <w:rPr>
+          <w:rtl w:val="0"/>
+        </w:rPr>
       </w:r>
     </w:p>
     <w:tbl>
       <w:tblPr>
-        <w:tblW w:type="auto" w:w="0"/>
+        <w:tblStyle w:val="Table1"/>
+        <w:tblW w:w="9585.0" w:type="dxa"/>
         <w:jc w:val="center"/>
-        <w:tblLook w:firstColumn="1" w:firstRow="1" w:lastColumn="0" w:lastRow="0" w:noHBand="0" w:noVBand="1" w:val="04A0"/>
+        <w:tblBorders>
+          <w:top w:color="000000" w:space="0" w:sz="8" w:val="single"/>
+          <w:left w:color="000000" w:space="0" w:sz="8" w:val="single"/>
+          <w:bottom w:color="000000" w:space="0" w:sz="8" w:val="single"/>
+          <w:right w:color="000000" w:space="0" w:sz="8" w:val="single"/>
+          <w:insideH w:color="000000" w:space="0" w:sz="8" w:val="single"/>
+          <w:insideV w:color="000000" w:space="0" w:sz="8" w:val="single"/>
+        </w:tblBorders>
+        <w:tblLayout w:type="fixed"/>
+        <w:tblLook w:val="0600"/>
       </w:tblPr>
       <w:tblGrid>
-        <w:gridCol w:w="9072"/>
+        <w:gridCol w:w="840"/>
+        <w:gridCol w:w="4815"/>
+        <w:gridCol w:w="1275"/>
+        <w:gridCol w:w="2655"/>
+        <w:tblGridChange w:id="0">
+          <w:tblGrid>
+            <w:gridCol w:w="840"/>
+            <w:gridCol w:w="4815"/>
+            <w:gridCol w:w="1275"/>
+            <w:gridCol w:w="2655"/>
+          </w:tblGrid>
+        </w:tblGridChange>
       </w:tblGrid>
       <w:tr>
         <w:trPr>
-          <w:trHeight w:val="3402" w:hRule="atLeast"/>
+          <w:cantSplit w:val="0"/>
+          <w:tblHeader w:val="0"/>
         </w:trPr>
         <w:tc>
           <w:tcPr>
-            <w:tcW w:type="dxa" w:w="4252"/>
-            <w:shd w:val="clear" w:color="auto" w:fill="FAFAFA"/>
             <w:tcBorders>
-              <w:top w:val="single" w:sz="8" w:space="0" w:color="BBBBBB"/>
-              <w:left w:val="single" w:sz="8" w:space="0" w:color="BBBBBB"/>
-              <w:bottom w:val="single" w:sz="8" w:space="0" w:color="BBBBBB"/>
-              <w:right w:val="single" w:sz="8" w:space="0" w:color="BBBBBB"/>
+              <w:right w:color="434343" w:space="0" w:sz="8" w:val="single"/>
             </w:tcBorders>
-            <w:vAlign w:val="center"/>
+            <w:shd w:fill="d9d9d9" w:val="clear"/>
+            <w:tcMar>
+              <w:top w:w="100.0" w:type="dxa"/>
+              <w:left w:w="100.0" w:type="dxa"/>
+              <w:bottom w:w="100.0" w:type="dxa"/>
+              <w:right w:w="100.0" w:type="dxa"/>
+            </w:tcMar>
+            <w:vAlign w:val="top"/>
           </w:tcPr>
           <w:p>
             <w:pPr>
+              <w:widowControl w:val="0"/>
+              <w:spacing w:after="0" w:line="276" w:lineRule="auto"/>
               <w:jc w:val="center"/>
+              <w:rPr>
+                <w:rFonts w:ascii="Arial" w:cs="Arial" w:eastAsia="Arial" w:hAnsi="Arial"/>
+                <w:b w:val="1"/>
+                <w:bCs w:val="1"/>
+                <w:sz w:val="24"/>
+                <w:szCs w:val="24"/>
+              </w:rPr>
             </w:pPr>
             <w:r>
               <w:rPr>
-                <w:b/>
-                <w:color w:val="666666"/>
-                <w:sz w:val="22"/>
-              </w:rPr>
-              <w:t>🖼  App Home Screen (Ledger)</w:t>
-            </w:r>
-          </w:p>
+                <w:rFonts w:ascii="Arial" w:cs="Arial" w:eastAsia="Arial" w:hAnsi="Arial"/>
+                <w:b w:val="1"/>
+                <w:bCs w:val="1"/>
+                <w:sz w:val="24"/>
+                <w:szCs w:val="24"/>
+                <w:rtl w:val="0"/>
+              </w:rPr>
+              <w:t xml:space="preserve">BIL</w:t>
+            </w:r>
+          </w:p>
+        </w:tc>
+        <w:tc>
+          <w:tcPr>
+            <w:tcBorders>
+              <w:top w:color="434343" w:space="0" w:sz="8" w:val="single"/>
+              <w:left w:color="434343" w:space="0" w:sz="8" w:val="single"/>
+              <w:bottom w:color="434343" w:space="0" w:sz="8" w:val="single"/>
+              <w:right w:color="434343" w:space="0" w:sz="8" w:val="single"/>
+            </w:tcBorders>
+            <w:shd w:fill="d9d9d9" w:val="clear"/>
+            <w:tcMar>
+              <w:top w:w="100.0" w:type="dxa"/>
+              <w:left w:w="100.0" w:type="dxa"/>
+              <w:bottom w:w="100.0" w:type="dxa"/>
+              <w:right w:w="100.0" w:type="dxa"/>
+            </w:tcMar>
+            <w:vAlign w:val="top"/>
+          </w:tcPr>
           <w:p>
             <w:pPr>
+              <w:widowControl w:val="0"/>
+              <w:spacing w:after="0" w:line="276" w:lineRule="auto"/>
               <w:jc w:val="center"/>
+              <w:rPr>
+                <w:rFonts w:ascii="Arial" w:cs="Arial" w:eastAsia="Arial" w:hAnsi="Arial"/>
+                <w:b w:val="1"/>
+                <w:bCs w:val="1"/>
+                <w:sz w:val="24"/>
+                <w:szCs w:val="24"/>
+              </w:rPr>
             </w:pPr>
             <w:r>
               <w:rPr>
-                <w:i/>
-                <w:color w:val="AAAAAA"/>
-                <w:sz w:val="16"/>
-              </w:rPr>
-              <w:t>[ insert screenshot here ]</w:t>
+                <w:rFonts w:ascii="Arial" w:cs="Arial" w:eastAsia="Arial" w:hAnsi="Arial"/>
+                <w:b w:val="1"/>
+                <w:bCs w:val="1"/>
+                <w:sz w:val="24"/>
+                <w:szCs w:val="24"/>
+                <w:rtl w:val="0"/>
+              </w:rPr>
+              <w:t xml:space="preserve">NAMA</w:t>
+            </w:r>
+          </w:p>
+        </w:tc>
+        <w:tc>
+          <w:tcPr>
+            <w:tcBorders>
+              <w:top w:color="434343" w:space="0" w:sz="8" w:val="single"/>
+              <w:left w:color="434343" w:space="0" w:sz="8" w:val="single"/>
+              <w:bottom w:color="434343" w:space="0" w:sz="8" w:val="single"/>
+              <w:right w:color="434343" w:space="0" w:sz="8" w:val="single"/>
+            </w:tcBorders>
+            <w:shd w:fill="d9d9d9" w:val="clear"/>
+            <w:tcMar>
+              <w:top w:w="100.0" w:type="dxa"/>
+              <w:left w:w="100.0" w:type="dxa"/>
+              <w:bottom w:w="100.0" w:type="dxa"/>
+              <w:right w:w="100.0" w:type="dxa"/>
+            </w:tcMar>
+            <w:vAlign w:val="top"/>
+          </w:tcPr>
+          <w:p>
+            <w:pPr>
+              <w:widowControl w:val="0"/>
+              <w:spacing w:after="0" w:line="276" w:lineRule="auto"/>
+              <w:jc w:val="center"/>
+              <w:rPr>
+                <w:rFonts w:ascii="Arial" w:cs="Arial" w:eastAsia="Arial" w:hAnsi="Arial"/>
+                <w:b w:val="1"/>
+                <w:bCs w:val="1"/>
+              </w:rPr>
+            </w:pPr>
+            <w:r>
+              <w:rPr>
+                <w:rFonts w:ascii="Arial" w:cs="Arial" w:eastAsia="Arial" w:hAnsi="Arial"/>
+                <w:b w:val="1"/>
+                <w:bCs w:val="1"/>
+                <w:rtl w:val="0"/>
+              </w:rPr>
+              <w:t xml:space="preserve">GROUP</w:t>
+            </w:r>
+          </w:p>
+        </w:tc>
+        <w:tc>
+          <w:tcPr>
+            <w:tcBorders>
+              <w:top w:color="434343" w:space="0" w:sz="8" w:val="single"/>
+              <w:left w:color="434343" w:space="0" w:sz="8" w:val="single"/>
+              <w:bottom w:color="434343" w:space="0" w:sz="8" w:val="single"/>
+              <w:right w:color="434343" w:space="0" w:sz="8" w:val="single"/>
+            </w:tcBorders>
+            <w:shd w:fill="d9d9d9" w:val="clear"/>
+            <w:tcMar>
+              <w:top w:w="100.0" w:type="dxa"/>
+              <w:left w:w="100.0" w:type="dxa"/>
+              <w:bottom w:w="100.0" w:type="dxa"/>
+              <w:right w:w="100.0" w:type="dxa"/>
+            </w:tcMar>
+            <w:vAlign w:val="top"/>
+          </w:tcPr>
+          <w:p>
+            <w:pPr>
+              <w:widowControl w:val="0"/>
+              <w:spacing w:after="0" w:line="276" w:lineRule="auto"/>
+              <w:jc w:val="center"/>
+              <w:rPr>
+                <w:rFonts w:ascii="Arial" w:cs="Arial" w:eastAsia="Arial" w:hAnsi="Arial"/>
+                <w:b w:val="1"/>
+                <w:bCs w:val="1"/>
+                <w:sz w:val="24"/>
+                <w:szCs w:val="24"/>
+              </w:rPr>
+            </w:pPr>
+            <w:r>
+              <w:rPr>
+                <w:rFonts w:ascii="Arial" w:cs="Arial" w:eastAsia="Arial" w:hAnsi="Arial"/>
+                <w:b w:val="1"/>
+                <w:bCs w:val="1"/>
+                <w:sz w:val="24"/>
+                <w:szCs w:val="24"/>
+                <w:rtl w:val="0"/>
+              </w:rPr>
+              <w:t xml:space="preserve">NO MATRIK</w:t>
+            </w:r>
+          </w:p>
+        </w:tc>
+      </w:tr>
+      <w:tr>
+        <w:trPr>
+          <w:cantSplit w:val="0"/>
+          <w:tblHeader w:val="0"/>
+        </w:trPr>
+        <w:tc>
+          <w:tcPr>
+            <w:shd w:fill="auto" w:val="clear"/>
+            <w:tcMar>
+              <w:top w:w="100.0" w:type="dxa"/>
+              <w:left w:w="100.0" w:type="dxa"/>
+              <w:bottom w:w="100.0" w:type="dxa"/>
+              <w:right w:w="100.0" w:type="dxa"/>
+            </w:tcMar>
+            <w:vAlign w:val="top"/>
+          </w:tcPr>
+          <w:p>
+            <w:pPr>
+              <w:widowControl w:val="0"/>
+              <w:spacing w:after="0" w:line="276" w:lineRule="auto"/>
+              <w:jc w:val="center"/>
+              <w:rPr>
+                <w:rFonts w:ascii="Arial" w:cs="Arial" w:eastAsia="Arial" w:hAnsi="Arial"/>
+                <w:sz w:val="20"/>
+                <w:szCs w:val="20"/>
+              </w:rPr>
+            </w:pPr>
+            <w:r>
+              <w:rPr>
+                <w:rFonts w:ascii="Arial" w:cs="Arial" w:eastAsia="Arial" w:hAnsi="Arial"/>
+                <w:sz w:val="20"/>
+                <w:szCs w:val="20"/>
+                <w:rtl w:val="0"/>
+              </w:rPr>
+              <w:t xml:space="preserve">1</w:t>
+            </w:r>
+          </w:p>
+        </w:tc>
+        <w:tc>
+          <w:tcPr>
+            <w:tcBorders>
+              <w:top w:color="434343" w:space="0" w:sz="8" w:val="single"/>
+            </w:tcBorders>
+            <w:shd w:fill="auto" w:val="clear"/>
+            <w:tcMar>
+              <w:top w:w="100.0" w:type="dxa"/>
+              <w:left w:w="100.0" w:type="dxa"/>
+              <w:bottom w:w="100.0" w:type="dxa"/>
+              <w:right w:w="100.0" w:type="dxa"/>
+            </w:tcMar>
+            <w:vAlign w:val="top"/>
+          </w:tcPr>
+          <w:p>
+            <w:pPr>
+              <w:widowControl w:val="0"/>
+              <w:spacing w:after="0" w:line="276" w:lineRule="auto"/>
+              <w:rPr>
+                <w:rFonts w:ascii="Arial" w:cs="Arial" w:eastAsia="Arial" w:hAnsi="Arial"/>
+                <w:sz w:val="20"/>
+                <w:szCs w:val="20"/>
+              </w:rPr>
+            </w:pPr>
+            <w:r>
+              <w:rPr>
+                <w:rFonts w:ascii="Arial" w:cs="Arial" w:eastAsia="Arial" w:hAnsi="Arial"/>
+                <w:sz w:val="20"/>
+                <w:szCs w:val="20"/>
+                <w:rtl w:val="0"/>
+              </w:rPr>
+              <w:t xml:space="preserve">SHI KAIYAN</w:t>
+            </w:r>
+          </w:p>
+        </w:tc>
+        <w:tc>
+          <w:tcPr>
+            <w:tcBorders>
+              <w:top w:color="434343" w:space="0" w:sz="8" w:val="single"/>
+            </w:tcBorders>
+            <w:shd w:fill="auto" w:val="clear"/>
+            <w:tcMar>
+              <w:top w:w="100.0" w:type="dxa"/>
+              <w:left w:w="100.0" w:type="dxa"/>
+              <w:bottom w:w="100.0" w:type="dxa"/>
+              <w:right w:w="100.0" w:type="dxa"/>
+            </w:tcMar>
+            <w:vAlign w:val="top"/>
+          </w:tcPr>
+          <w:p>
+            <w:pPr>
+              <w:widowControl w:val="0"/>
+              <w:spacing w:after="0" w:line="276" w:lineRule="auto"/>
+              <w:jc w:val="center"/>
+              <w:rPr>
+                <w:rFonts w:ascii="Arial" w:cs="Arial" w:eastAsia="Arial" w:hAnsi="Arial"/>
+                <w:sz w:val="20"/>
+                <w:szCs w:val="20"/>
+              </w:rPr>
+            </w:pPr>
+            <w:r>
+              <w:rPr>
+                <w:rFonts w:ascii="Arial" w:cs="Arial" w:eastAsia="Arial" w:hAnsi="Arial"/>
+                <w:sz w:val="20"/>
+                <w:szCs w:val="20"/>
+                <w:rtl w:val="0"/>
+              </w:rPr>
+              <w:t xml:space="preserve">B</w:t>
+            </w:r>
+          </w:p>
+        </w:tc>
+        <w:tc>
+          <w:tcPr>
+            <w:tcBorders>
+              <w:top w:color="434343" w:space="0" w:sz="8" w:val="single"/>
+            </w:tcBorders>
+            <w:shd w:fill="auto" w:val="clear"/>
+            <w:tcMar>
+              <w:top w:w="100.0" w:type="dxa"/>
+              <w:left w:w="100.0" w:type="dxa"/>
+              <w:bottom w:w="100.0" w:type="dxa"/>
+              <w:right w:w="100.0" w:type="dxa"/>
+            </w:tcMar>
+            <w:vAlign w:val="top"/>
+          </w:tcPr>
+          <w:p>
+            <w:pPr>
+              <w:widowControl w:val="0"/>
+              <w:spacing w:after="0" w:line="276" w:lineRule="auto"/>
+              <w:jc w:val="center"/>
+              <w:rPr>
+                <w:rFonts w:ascii="Arial" w:cs="Arial" w:eastAsia="Arial" w:hAnsi="Arial"/>
+                <w:sz w:val="20"/>
+                <w:szCs w:val="20"/>
+              </w:rPr>
+            </w:pPr>
+            <w:r>
+              <w:rPr>
+                <w:rFonts w:ascii="Arial" w:cs="Arial" w:eastAsia="Arial" w:hAnsi="Arial"/>
+                <w:sz w:val="20"/>
+                <w:szCs w:val="20"/>
+                <w:rtl w:val="0"/>
+              </w:rPr>
+              <w:t xml:space="preserve">D20231109007</w:t>
+            </w:r>
+          </w:p>
+        </w:tc>
+      </w:tr>
+      <w:tr>
+        <w:trPr>
+          <w:cantSplit w:val="0"/>
+          <w:tblHeader w:val="0"/>
+        </w:trPr>
+        <w:tc>
+          <w:tcPr>
+            <w:shd w:fill="auto" w:val="clear"/>
+            <w:tcMar>
+              <w:top w:w="100.0" w:type="dxa"/>
+              <w:left w:w="100.0" w:type="dxa"/>
+              <w:bottom w:w="100.0" w:type="dxa"/>
+              <w:right w:w="100.0" w:type="dxa"/>
+            </w:tcMar>
+            <w:vAlign w:val="top"/>
+          </w:tcPr>
+          <w:p>
+            <w:pPr>
+              <w:widowControl w:val="0"/>
+              <w:spacing w:after="0" w:line="276" w:lineRule="auto"/>
+              <w:jc w:val="center"/>
+              <w:rPr>
+                <w:rFonts w:ascii="Arial" w:cs="Arial" w:eastAsia="Arial" w:hAnsi="Arial"/>
+                <w:sz w:val="20"/>
+                <w:szCs w:val="20"/>
+              </w:rPr>
+            </w:pPr>
+            <w:r>
+              <w:rPr>
+                <w:rFonts w:ascii="Arial" w:cs="Arial" w:eastAsia="Arial" w:hAnsi="Arial"/>
+                <w:sz w:val="20"/>
+                <w:szCs w:val="20"/>
+                <w:rtl w:val="0"/>
+              </w:rPr>
+              <w:t xml:space="preserve">2</w:t>
+            </w:r>
+          </w:p>
+        </w:tc>
+        <w:tc>
+          <w:tcPr>
+            <w:tcMar>
+              <w:top w:w="100.0" w:type="dxa"/>
+              <w:left w:w="100.0" w:type="dxa"/>
+              <w:bottom w:w="100.0" w:type="dxa"/>
+              <w:right w:w="100.0" w:type="dxa"/>
+            </w:tcMar>
+            <w:vAlign w:val="top"/>
+          </w:tcPr>
+          <w:p>
+            <w:pPr>
+              <w:widowControl w:val="0"/>
+              <w:spacing w:after="0" w:line="276" w:lineRule="auto"/>
+              <w:rPr>
+                <w:rFonts w:ascii="Arial" w:cs="Arial" w:eastAsia="Arial" w:hAnsi="Arial"/>
+                <w:sz w:val="20"/>
+                <w:szCs w:val="20"/>
+              </w:rPr>
+            </w:pPr>
+            <w:r>
+              <w:rPr>
+                <w:rFonts w:ascii="Arial" w:cs="Arial" w:eastAsia="Arial" w:hAnsi="Arial"/>
+                <w:sz w:val="20"/>
+                <w:szCs w:val="20"/>
+                <w:rtl w:val="0"/>
+              </w:rPr>
+              <w:t xml:space="preserve">SAZIT UL ISLAM</w:t>
+            </w:r>
+          </w:p>
+        </w:tc>
+        <w:tc>
+          <w:tcPr>
+            <w:tcMar>
+              <w:top w:w="100.0" w:type="dxa"/>
+              <w:left w:w="100.0" w:type="dxa"/>
+              <w:bottom w:w="100.0" w:type="dxa"/>
+              <w:right w:w="100.0" w:type="dxa"/>
+            </w:tcMar>
+            <w:vAlign w:val="top"/>
+          </w:tcPr>
+          <w:p>
+            <w:pPr>
+              <w:widowControl w:val="0"/>
+              <w:spacing w:after="0" w:line="276" w:lineRule="auto"/>
+              <w:jc w:val="center"/>
+              <w:rPr>
+                <w:rFonts w:ascii="Arial" w:cs="Arial" w:eastAsia="Arial" w:hAnsi="Arial"/>
+                <w:sz w:val="20"/>
+                <w:szCs w:val="20"/>
+              </w:rPr>
+            </w:pPr>
+            <w:r>
+              <w:rPr>
+                <w:rFonts w:ascii="Arial" w:cs="Arial" w:eastAsia="Arial" w:hAnsi="Arial"/>
+                <w:sz w:val="20"/>
+                <w:szCs w:val="20"/>
+                <w:rtl w:val="0"/>
+              </w:rPr>
+              <w:t xml:space="preserve">A</w:t>
+            </w:r>
+          </w:p>
+        </w:tc>
+        <w:tc>
+          <w:tcPr>
+            <w:tcMar>
+              <w:top w:w="100.0" w:type="dxa"/>
+              <w:left w:w="100.0" w:type="dxa"/>
+              <w:bottom w:w="100.0" w:type="dxa"/>
+              <w:right w:w="100.0" w:type="dxa"/>
+            </w:tcMar>
+            <w:vAlign w:val="top"/>
+          </w:tcPr>
+          <w:p>
+            <w:pPr>
+              <w:widowControl w:val="0"/>
+              <w:spacing w:after="0" w:line="276" w:lineRule="auto"/>
+              <w:jc w:val="center"/>
+              <w:rPr>
+                <w:rFonts w:ascii="Arial" w:cs="Arial" w:eastAsia="Arial" w:hAnsi="Arial"/>
+                <w:sz w:val="20"/>
+                <w:szCs w:val="20"/>
+              </w:rPr>
+            </w:pPr>
+            <w:r>
+              <w:rPr>
+                <w:rtl w:val="0"/>
+              </w:rPr>
+            </w:r>
+          </w:p>
+        </w:tc>
+      </w:tr>
+      <w:tr>
+        <w:trPr>
+          <w:cantSplit w:val="0"/>
+          <w:tblHeader w:val="0"/>
+        </w:trPr>
+        <w:tc>
+          <w:tcPr>
+            <w:shd w:fill="auto" w:val="clear"/>
+            <w:tcMar>
+              <w:top w:w="100.0" w:type="dxa"/>
+              <w:left w:w="100.0" w:type="dxa"/>
+              <w:bottom w:w="100.0" w:type="dxa"/>
+              <w:right w:w="100.0" w:type="dxa"/>
+            </w:tcMar>
+            <w:vAlign w:val="top"/>
+          </w:tcPr>
+          <w:p>
+            <w:pPr>
+              <w:widowControl w:val="0"/>
+              <w:spacing w:after="0" w:line="276" w:lineRule="auto"/>
+              <w:jc w:val="center"/>
+              <w:rPr>
+                <w:rFonts w:ascii="Arial" w:cs="Arial" w:eastAsia="Arial" w:hAnsi="Arial"/>
+                <w:sz w:val="20"/>
+                <w:szCs w:val="20"/>
+              </w:rPr>
+            </w:pPr>
+            <w:r>
+              <w:rPr>
+                <w:rFonts w:ascii="Arial" w:cs="Arial" w:eastAsia="Arial" w:hAnsi="Arial"/>
+                <w:sz w:val="20"/>
+                <w:szCs w:val="20"/>
+                <w:rtl w:val="0"/>
+              </w:rPr>
+              <w:t xml:space="preserve">3</w:t>
+            </w:r>
+          </w:p>
+        </w:tc>
+        <w:tc>
+          <w:tcPr>
+            <w:shd w:fill="auto" w:val="clear"/>
+            <w:tcMar>
+              <w:top w:w="100.0" w:type="dxa"/>
+              <w:left w:w="100.0" w:type="dxa"/>
+              <w:bottom w:w="100.0" w:type="dxa"/>
+              <w:right w:w="100.0" w:type="dxa"/>
+            </w:tcMar>
+            <w:vAlign w:val="top"/>
+          </w:tcPr>
+          <w:p>
+            <w:pPr>
+              <w:widowControl w:val="0"/>
+              <w:spacing w:after="0" w:line="276" w:lineRule="auto"/>
+              <w:rPr>
+                <w:rFonts w:ascii="Arial" w:cs="Arial" w:eastAsia="Arial" w:hAnsi="Arial"/>
+                <w:sz w:val="20"/>
+                <w:szCs w:val="20"/>
+              </w:rPr>
+            </w:pPr>
+            <w:r>
+              <w:rPr>
+                <w:rFonts w:ascii="Arial" w:cs="Arial" w:eastAsia="Arial" w:hAnsi="Arial"/>
+                <w:sz w:val="20"/>
+                <w:szCs w:val="20"/>
+                <w:rtl w:val="0"/>
+              </w:rPr>
+              <w:t xml:space="preserve">NUR AISYATUL NAJWA BINTI MOHAMAD NASIR </w:t>
+            </w:r>
+          </w:p>
+        </w:tc>
+        <w:tc>
+          <w:tcPr>
+            <w:shd w:fill="auto" w:val="clear"/>
+            <w:tcMar>
+              <w:top w:w="100.0" w:type="dxa"/>
+              <w:left w:w="100.0" w:type="dxa"/>
+              <w:bottom w:w="100.0" w:type="dxa"/>
+              <w:right w:w="100.0" w:type="dxa"/>
+            </w:tcMar>
+            <w:vAlign w:val="top"/>
+          </w:tcPr>
+          <w:p>
+            <w:pPr>
+              <w:widowControl w:val="0"/>
+              <w:spacing w:after="0" w:line="276" w:lineRule="auto"/>
+              <w:jc w:val="center"/>
+              <w:rPr>
+                <w:rFonts w:ascii="Arial" w:cs="Arial" w:eastAsia="Arial" w:hAnsi="Arial"/>
+                <w:sz w:val="20"/>
+                <w:szCs w:val="20"/>
+              </w:rPr>
+            </w:pPr>
+            <w:r>
+              <w:rPr>
+                <w:rFonts w:ascii="Arial" w:cs="Arial" w:eastAsia="Arial" w:hAnsi="Arial"/>
+                <w:sz w:val="20"/>
+                <w:szCs w:val="20"/>
+                <w:rtl w:val="0"/>
+              </w:rPr>
+              <w:t xml:space="preserve">A</w:t>
+            </w:r>
+          </w:p>
+        </w:tc>
+        <w:tc>
+          <w:tcPr>
+            <w:shd w:fill="auto" w:val="clear"/>
+            <w:tcMar>
+              <w:top w:w="100.0" w:type="dxa"/>
+              <w:left w:w="100.0" w:type="dxa"/>
+              <w:bottom w:w="100.0" w:type="dxa"/>
+              <w:right w:w="100.0" w:type="dxa"/>
+            </w:tcMar>
+            <w:vAlign w:val="top"/>
+          </w:tcPr>
+          <w:p>
+            <w:pPr>
+              <w:widowControl w:val="0"/>
+              <w:spacing w:after="0" w:line="276" w:lineRule="auto"/>
+              <w:jc w:val="center"/>
+              <w:rPr>
+                <w:rFonts w:ascii="Arial" w:cs="Arial" w:eastAsia="Arial" w:hAnsi="Arial"/>
+                <w:sz w:val="20"/>
+                <w:szCs w:val="20"/>
+              </w:rPr>
+            </w:pPr>
+            <w:r>
+              <w:rPr>
+                <w:rtl w:val="0"/>
+              </w:rPr>
+            </w:r>
+          </w:p>
+        </w:tc>
+      </w:tr>
+      <w:tr>
+        <w:trPr>
+          <w:cantSplit w:val="0"/>
+          <w:tblHeader w:val="0"/>
+        </w:trPr>
+        <w:tc>
+          <w:tcPr>
+            <w:shd w:fill="auto" w:val="clear"/>
+            <w:tcMar>
+              <w:top w:w="100.0" w:type="dxa"/>
+              <w:left w:w="100.0" w:type="dxa"/>
+              <w:bottom w:w="100.0" w:type="dxa"/>
+              <w:right w:w="100.0" w:type="dxa"/>
+            </w:tcMar>
+            <w:vAlign w:val="top"/>
+          </w:tcPr>
+          <w:p>
+            <w:pPr>
+              <w:widowControl w:val="0"/>
+              <w:spacing w:after="0" w:line="276" w:lineRule="auto"/>
+              <w:jc w:val="center"/>
+              <w:rPr>
+                <w:rFonts w:ascii="Arial" w:cs="Arial" w:eastAsia="Arial" w:hAnsi="Arial"/>
+                <w:sz w:val="20"/>
+                <w:szCs w:val="20"/>
+              </w:rPr>
+            </w:pPr>
+            <w:r>
+              <w:rPr>
+                <w:rFonts w:ascii="Arial" w:cs="Arial" w:eastAsia="Arial" w:hAnsi="Arial"/>
+                <w:sz w:val="20"/>
+                <w:szCs w:val="20"/>
+                <w:rtl w:val="0"/>
+              </w:rPr>
+              <w:t xml:space="preserve">4</w:t>
+            </w:r>
+          </w:p>
+        </w:tc>
+        <w:tc>
+          <w:tcPr>
+            <w:shd w:fill="auto" w:val="clear"/>
+            <w:tcMar>
+              <w:top w:w="100.0" w:type="dxa"/>
+              <w:left w:w="100.0" w:type="dxa"/>
+              <w:bottom w:w="100.0" w:type="dxa"/>
+              <w:right w:w="100.0" w:type="dxa"/>
+            </w:tcMar>
+            <w:vAlign w:val="top"/>
+          </w:tcPr>
+          <w:p>
+            <w:pPr>
+              <w:widowControl w:val="0"/>
+              <w:spacing w:after="0" w:line="276" w:lineRule="auto"/>
+              <w:rPr>
+                <w:rFonts w:ascii="Arial" w:cs="Arial" w:eastAsia="Arial" w:hAnsi="Arial"/>
+                <w:sz w:val="20"/>
+                <w:szCs w:val="20"/>
+              </w:rPr>
+            </w:pPr>
+            <w:r>
+              <w:rPr>
+                <w:rFonts w:ascii="Arial" w:cs="Arial" w:eastAsia="Arial" w:hAnsi="Arial"/>
+                <w:sz w:val="20"/>
+                <w:szCs w:val="20"/>
+                <w:rtl w:val="0"/>
+              </w:rPr>
+              <w:t xml:space="preserve">NURFATIN AQILAH BINTI ZOLKIFLI</w:t>
+            </w:r>
+          </w:p>
+        </w:tc>
+        <w:tc>
+          <w:tcPr>
+            <w:shd w:fill="auto" w:val="clear"/>
+            <w:tcMar>
+              <w:top w:w="100.0" w:type="dxa"/>
+              <w:left w:w="100.0" w:type="dxa"/>
+              <w:bottom w:w="100.0" w:type="dxa"/>
+              <w:right w:w="100.0" w:type="dxa"/>
+            </w:tcMar>
+            <w:vAlign w:val="top"/>
+          </w:tcPr>
+          <w:p>
+            <w:pPr>
+              <w:widowControl w:val="0"/>
+              <w:spacing w:after="0" w:line="276" w:lineRule="auto"/>
+              <w:jc w:val="center"/>
+              <w:rPr>
+                <w:rFonts w:ascii="Arial" w:cs="Arial" w:eastAsia="Arial" w:hAnsi="Arial"/>
+                <w:sz w:val="20"/>
+                <w:szCs w:val="20"/>
+              </w:rPr>
+            </w:pPr>
+            <w:r>
+              <w:rPr>
+                <w:rFonts w:ascii="Arial" w:cs="Arial" w:eastAsia="Arial" w:hAnsi="Arial"/>
+                <w:sz w:val="20"/>
+                <w:szCs w:val="20"/>
+                <w:rtl w:val="0"/>
+              </w:rPr>
+              <w:t xml:space="preserve">A</w:t>
+            </w:r>
+          </w:p>
+        </w:tc>
+        <w:tc>
+          <w:tcPr>
+            <w:shd w:fill="auto" w:val="clear"/>
+            <w:tcMar>
+              <w:top w:w="100.0" w:type="dxa"/>
+              <w:left w:w="100.0" w:type="dxa"/>
+              <w:bottom w:w="100.0" w:type="dxa"/>
+              <w:right w:w="100.0" w:type="dxa"/>
+            </w:tcMar>
+            <w:vAlign w:val="top"/>
+          </w:tcPr>
+          <w:p>
+            <w:pPr>
+              <w:widowControl w:val="0"/>
+              <w:spacing w:after="0" w:line="276" w:lineRule="auto"/>
+              <w:jc w:val="center"/>
+              <w:rPr>
+                <w:rFonts w:ascii="Arial" w:cs="Arial" w:eastAsia="Arial" w:hAnsi="Arial"/>
+                <w:sz w:val="20"/>
+                <w:szCs w:val="20"/>
+              </w:rPr>
+            </w:pPr>
+            <w:r>
+              <w:rPr>
+                <w:rtl w:val="0"/>
+              </w:rPr>
+            </w:r>
+          </w:p>
+        </w:tc>
+      </w:tr>
+      <w:tr>
+        <w:trPr>
+          <w:cantSplit w:val="0"/>
+          <w:tblHeader w:val="0"/>
+        </w:trPr>
+        <w:tc>
+          <w:tcPr>
+            <w:shd w:fill="auto" w:val="clear"/>
+            <w:tcMar>
+              <w:top w:w="100.0" w:type="dxa"/>
+              <w:left w:w="100.0" w:type="dxa"/>
+              <w:bottom w:w="100.0" w:type="dxa"/>
+              <w:right w:w="100.0" w:type="dxa"/>
+            </w:tcMar>
+            <w:vAlign w:val="top"/>
+          </w:tcPr>
+          <w:p>
+            <w:pPr>
+              <w:widowControl w:val="0"/>
+              <w:spacing w:after="0" w:line="276" w:lineRule="auto"/>
+              <w:jc w:val="center"/>
+              <w:rPr>
+                <w:rFonts w:ascii="Arial" w:cs="Arial" w:eastAsia="Arial" w:hAnsi="Arial"/>
+                <w:sz w:val="20"/>
+                <w:szCs w:val="20"/>
+              </w:rPr>
+            </w:pPr>
+            <w:r>
+              <w:rPr>
+                <w:rFonts w:ascii="Arial" w:cs="Arial" w:eastAsia="Arial" w:hAnsi="Arial"/>
+                <w:sz w:val="20"/>
+                <w:szCs w:val="20"/>
+                <w:rtl w:val="0"/>
+              </w:rPr>
+              <w:t xml:space="preserve">5</w:t>
+            </w:r>
+          </w:p>
+        </w:tc>
+        <w:tc>
+          <w:tcPr>
+            <w:shd w:fill="auto" w:val="clear"/>
+            <w:tcMar>
+              <w:top w:w="100.0" w:type="dxa"/>
+              <w:left w:w="100.0" w:type="dxa"/>
+              <w:bottom w:w="100.0" w:type="dxa"/>
+              <w:right w:w="100.0" w:type="dxa"/>
+            </w:tcMar>
+            <w:vAlign w:val="top"/>
+          </w:tcPr>
+          <w:p>
+            <w:pPr>
+              <w:widowControl w:val="0"/>
+              <w:spacing w:after="0" w:line="276" w:lineRule="auto"/>
+              <w:rPr>
+                <w:rFonts w:ascii="Arial" w:cs="Arial" w:eastAsia="Arial" w:hAnsi="Arial"/>
+                <w:sz w:val="20"/>
+                <w:szCs w:val="20"/>
+              </w:rPr>
+            </w:pPr>
+            <w:r>
+              <w:rPr>
+                <w:rFonts w:ascii="Arial" w:cs="Arial" w:eastAsia="Arial" w:hAnsi="Arial"/>
+                <w:sz w:val="20"/>
+                <w:szCs w:val="20"/>
+                <w:rtl w:val="0"/>
+              </w:rPr>
+              <w:t xml:space="preserve">MST SAMIYA HAQUE KOTHA</w:t>
+            </w:r>
+          </w:p>
+        </w:tc>
+        <w:tc>
+          <w:tcPr>
+            <w:shd w:fill="auto" w:val="clear"/>
+            <w:tcMar>
+              <w:top w:w="100.0" w:type="dxa"/>
+              <w:left w:w="100.0" w:type="dxa"/>
+              <w:bottom w:w="100.0" w:type="dxa"/>
+              <w:right w:w="100.0" w:type="dxa"/>
+            </w:tcMar>
+            <w:vAlign w:val="top"/>
+          </w:tcPr>
+          <w:p>
+            <w:pPr>
+              <w:widowControl w:val="0"/>
+              <w:spacing w:after="0" w:line="276" w:lineRule="auto"/>
+              <w:jc w:val="center"/>
+              <w:rPr>
+                <w:rFonts w:ascii="Arial" w:cs="Arial" w:eastAsia="Arial" w:hAnsi="Arial"/>
+                <w:sz w:val="20"/>
+                <w:szCs w:val="20"/>
+              </w:rPr>
+            </w:pPr>
+            <w:r>
+              <w:rPr>
+                <w:rFonts w:ascii="Arial" w:cs="Arial" w:eastAsia="Arial" w:hAnsi="Arial"/>
+                <w:sz w:val="20"/>
+                <w:szCs w:val="20"/>
+                <w:rtl w:val="0"/>
+              </w:rPr>
+              <w:t xml:space="preserve">A</w:t>
+            </w:r>
+          </w:p>
+        </w:tc>
+        <w:tc>
+          <w:tcPr>
+            <w:shd w:fill="auto" w:val="clear"/>
+            <w:tcMar>
+              <w:top w:w="100.0" w:type="dxa"/>
+              <w:left w:w="100.0" w:type="dxa"/>
+              <w:bottom w:w="100.0" w:type="dxa"/>
+              <w:right w:w="100.0" w:type="dxa"/>
+            </w:tcMar>
+            <w:vAlign w:val="top"/>
+          </w:tcPr>
+          <w:p>
+            <w:pPr>
+              <w:widowControl w:val="0"/>
+              <w:spacing w:after="0" w:line="276" w:lineRule="auto"/>
+              <w:jc w:val="center"/>
+              <w:rPr>
+                <w:rFonts w:ascii="Arial" w:cs="Arial" w:eastAsia="Arial" w:hAnsi="Arial"/>
+                <w:sz w:val="20"/>
+                <w:szCs w:val="20"/>
+              </w:rPr>
+            </w:pPr>
+            <w:r>
+              <w:rPr>
+                <w:rtl w:val="0"/>
+              </w:rPr>
             </w:r>
           </w:p>
         </w:tc>
@@ -137,432 +1361,94 @@
     </w:tbl>
     <w:p>
       <w:pPr>
-        <w:spacing w:after="200" w:before="40"/>
-        <w:jc w:val="center"/>
+        <w:spacing w:after="0" w:line="276" w:lineRule="auto"/>
+        <w:rPr>
+          <w:rFonts w:ascii="Arial" w:cs="Arial" w:eastAsia="Arial" w:hAnsi="Arial"/>
+          <w:b w:val="1"/>
+          <w:bCs w:val="1"/>
+          <w:sz w:val="24"/>
+          <w:szCs w:val="24"/>
+        </w:rPr>
       </w:pPr>
       <w:r>
         <w:rPr>
-          <w:b w:val="0"/>
-          <w:i/>
-          <w:color w:val="666666"/>
-          <w:sz w:val="18"/>
+          <w:rtl w:val="0"/>
         </w:rPr>
-        <w:t>Figure 1: The My Wallet home screen.</w:t>
       </w:r>
     </w:p>
     <w:p>
       <w:pPr>
-        <w:spacing w:after="400" w:before="0"/>
-      </w:pPr>
-    </w:p>
-    <w:p>
-      <w:pPr>
-        <w:spacing w:after="160" w:before="0"/>
-        <w:jc w:val="center"/>
+        <w:spacing w:after="0" w:line="276" w:lineRule="auto"/>
+        <w:rPr>
+          <w:rFonts w:ascii="Arial" w:cs="Arial" w:eastAsia="Arial" w:hAnsi="Arial"/>
+          <w:b w:val="1"/>
+          <w:bCs w:val="1"/>
+          <w:sz w:val="24"/>
+          <w:szCs w:val="24"/>
+        </w:rPr>
       </w:pPr>
       <w:r>
         <w:rPr>
-          <w:b/>
-          <w:i w:val="0"/>
-          <w:sz w:val="24"/>
+          <w:rtl w:val="0"/>
         </w:rPr>
-        <w:t>Submitted by Group [Group Name / Number]</w:t>
-      </w:r>
-    </w:p>
-    <w:tbl>
-      <w:tblPr>
-        <w:tblStyle w:val="TableGrid"/>
-        <w:tblW w:type="auto" w:w="0"/>
-        <w:jc w:val="center"/>
-        <w:tblLook w:firstColumn="1" w:firstRow="1" w:lastColumn="0" w:lastRow="0" w:noHBand="0" w:noVBand="1" w:val="04A0"/>
-      </w:tblPr>
-      <w:tblGrid>
-        <w:gridCol w:w="2268"/>
-        <w:gridCol w:w="2268"/>
-        <w:gridCol w:w="2268"/>
-        <w:gridCol w:w="2268"/>
-      </w:tblGrid>
-      <w:tr>
-        <w:tc>
-          <w:tcPr>
-            <w:tcW w:type="dxa" w:w="680"/>
-            <w:shd w:val="clear" w:color="auto" w:fill="FFF3CD"/>
-          </w:tcPr>
-          <w:p>
-            <w:pPr>
-              <w:jc w:val="left"/>
-            </w:pPr>
-            <w:r>
-              <w:rPr>
-                <w:b/>
-                <w:sz w:val="20"/>
-              </w:rPr>
-              <w:t>No.</w:t>
-            </w:r>
-          </w:p>
-        </w:tc>
-        <w:tc>
-          <w:tcPr>
-            <w:tcW w:type="dxa" w:w="2835"/>
-            <w:shd w:val="clear" w:color="auto" w:fill="FFF3CD"/>
-          </w:tcPr>
-          <w:p>
-            <w:pPr>
-              <w:jc w:val="left"/>
-            </w:pPr>
-            <w:r>
-              <w:rPr>
-                <w:b/>
-                <w:sz w:val="20"/>
-              </w:rPr>
-              <w:t>Member Name</w:t>
-            </w:r>
-          </w:p>
-        </w:tc>
-        <w:tc>
-          <w:tcPr>
-            <w:tcW w:type="dxa" w:w="1871"/>
-            <w:shd w:val="clear" w:color="auto" w:fill="FFF3CD"/>
-          </w:tcPr>
-          <w:p>
-            <w:pPr>
-              <w:jc w:val="left"/>
-            </w:pPr>
-            <w:r>
-              <w:rPr>
-                <w:b/>
-                <w:sz w:val="20"/>
-              </w:rPr>
-              <w:t>Student ID</w:t>
-            </w:r>
-          </w:p>
-        </w:tc>
-        <w:tc>
-          <w:tcPr>
-            <w:tcW w:type="dxa" w:w="3685"/>
-            <w:shd w:val="clear" w:color="auto" w:fill="FFF3CD"/>
-          </w:tcPr>
-          <w:p>
-            <w:pPr>
-              <w:jc w:val="left"/>
-            </w:pPr>
-            <w:r>
-              <w:rPr>
-                <w:b/>
-                <w:sz w:val="20"/>
-              </w:rPr>
-              <w:t>Primary Role</w:t>
-            </w:r>
-          </w:p>
-        </w:tc>
-      </w:tr>
-      <w:tr>
-        <w:tc>
-          <w:tcPr>
-            <w:tcW w:type="dxa" w:w="680"/>
-          </w:tcPr>
-          <w:p>
-            <w:r>
-              <w:rPr>
-                <w:sz w:val="20"/>
-              </w:rPr>
-              <w:t>1</w:t>
-            </w:r>
-          </w:p>
-        </w:tc>
-        <w:tc>
-          <w:tcPr>
-            <w:tcW w:type="dxa" w:w="2835"/>
-          </w:tcPr>
-          <w:p>
-            <w:r>
-              <w:rPr>
-                <w:sz w:val="20"/>
-              </w:rPr>
-              <w:t>Member 1</w:t>
-            </w:r>
-          </w:p>
-        </w:tc>
-        <w:tc>
-          <w:tcPr>
-            <w:tcW w:type="dxa" w:w="1871"/>
-          </w:tcPr>
-          <w:p>
-            <w:r>
-              <w:rPr>
-                <w:sz w:val="20"/>
-              </w:rPr>
-              <w:t>[Student ID]</w:t>
-            </w:r>
-          </w:p>
-        </w:tc>
-        <w:tc>
-          <w:tcPr>
-            <w:tcW w:type="dxa" w:w="3685"/>
-          </w:tcPr>
-          <w:p>
-            <w:r>
-              <w:rPr>
-                <w:sz w:val="20"/>
-              </w:rPr>
-              <w:t>Project Lead / State Management</w:t>
-            </w:r>
-          </w:p>
-        </w:tc>
-      </w:tr>
-      <w:tr>
-        <w:tc>
-          <w:tcPr>
-            <w:tcW w:type="dxa" w:w="680"/>
-          </w:tcPr>
-          <w:p>
-            <w:r>
-              <w:rPr>
-                <w:sz w:val="20"/>
-              </w:rPr>
-              <w:t>2</w:t>
-            </w:r>
-          </w:p>
-        </w:tc>
-        <w:tc>
-          <w:tcPr>
-            <w:tcW w:type="dxa" w:w="2835"/>
-          </w:tcPr>
-          <w:p>
-            <w:r>
-              <w:rPr>
-                <w:sz w:val="20"/>
-              </w:rPr>
-              <w:t>Member 2</w:t>
-            </w:r>
-          </w:p>
-        </w:tc>
-        <w:tc>
-          <w:tcPr>
-            <w:tcW w:type="dxa" w:w="1871"/>
-          </w:tcPr>
-          <w:p>
-            <w:r>
-              <w:rPr>
-                <w:sz w:val="20"/>
-              </w:rPr>
-              <w:t>[Student ID]</w:t>
-            </w:r>
-          </w:p>
-        </w:tc>
-        <w:tc>
-          <w:tcPr>
-            <w:tcW w:type="dxa" w:w="3685"/>
-          </w:tcPr>
-          <w:p>
-            <w:r>
-              <w:rPr>
-                <w:sz w:val="20"/>
-              </w:rPr>
-              <w:t>UI/UX — Ledger &amp; Detail</w:t>
-            </w:r>
-          </w:p>
-        </w:tc>
-      </w:tr>
-      <w:tr>
-        <w:tc>
-          <w:tcPr>
-            <w:tcW w:type="dxa" w:w="680"/>
-          </w:tcPr>
-          <w:p>
-            <w:r>
-              <w:rPr>
-                <w:sz w:val="20"/>
-              </w:rPr>
-              <w:t>3</w:t>
-            </w:r>
-          </w:p>
-        </w:tc>
-        <w:tc>
-          <w:tcPr>
-            <w:tcW w:type="dxa" w:w="2835"/>
-          </w:tcPr>
-          <w:p>
-            <w:r>
-              <w:rPr>
-                <w:sz w:val="20"/>
-              </w:rPr>
-              <w:t>Member 3</w:t>
-            </w:r>
-          </w:p>
-        </w:tc>
-        <w:tc>
-          <w:tcPr>
-            <w:tcW w:type="dxa" w:w="1871"/>
-          </w:tcPr>
-          <w:p>
-            <w:r>
-              <w:rPr>
-                <w:sz w:val="20"/>
-              </w:rPr>
-              <w:t>[Student ID]</w:t>
-            </w:r>
-          </w:p>
-        </w:tc>
-        <w:tc>
-          <w:tcPr>
-            <w:tcW w:type="dxa" w:w="3685"/>
-          </w:tcPr>
-          <w:p>
-            <w:r>
-              <w:rPr>
-                <w:sz w:val="20"/>
-              </w:rPr>
-              <w:t>Charts &amp; Discover</w:t>
-            </w:r>
-          </w:p>
-        </w:tc>
-      </w:tr>
-      <w:tr>
-        <w:tc>
-          <w:tcPr>
-            <w:tcW w:type="dxa" w:w="680"/>
-          </w:tcPr>
-          <w:p>
-            <w:r>
-              <w:rPr>
-                <w:sz w:val="20"/>
-              </w:rPr>
-              <w:t>4</w:t>
-            </w:r>
-          </w:p>
-        </w:tc>
-        <w:tc>
-          <w:tcPr>
-            <w:tcW w:type="dxa" w:w="2835"/>
-          </w:tcPr>
-          <w:p>
-            <w:r>
-              <w:rPr>
-                <w:sz w:val="20"/>
-              </w:rPr>
-              <w:t>Member 4</w:t>
-            </w:r>
-          </w:p>
-        </w:tc>
-        <w:tc>
-          <w:tcPr>
-            <w:tcW w:type="dxa" w:w="1871"/>
-          </w:tcPr>
-          <w:p>
-            <w:r>
-              <w:rPr>
-                <w:sz w:val="20"/>
-              </w:rPr>
-              <w:t>[Student ID]</w:t>
-            </w:r>
-          </w:p>
-        </w:tc>
-        <w:tc>
-          <w:tcPr>
-            <w:tcW w:type="dxa" w:w="3685"/>
-          </w:tcPr>
-          <w:p>
-            <w:r>
-              <w:rPr>
-                <w:sz w:val="20"/>
-              </w:rPr>
-              <w:t>Persistence &amp; Testing</w:t>
-            </w:r>
-          </w:p>
-        </w:tc>
-      </w:tr>
-      <w:tr>
-        <w:tc>
-          <w:tcPr>
-            <w:tcW w:type="dxa" w:w="680"/>
-          </w:tcPr>
-          <w:p>
-            <w:r>
-              <w:rPr>
-                <w:sz w:val="20"/>
-              </w:rPr>
-              <w:t>5</w:t>
-            </w:r>
-          </w:p>
-        </w:tc>
-        <w:tc>
-          <w:tcPr>
-            <w:tcW w:type="dxa" w:w="2835"/>
-          </w:tcPr>
-          <w:p>
-            <w:r>
-              <w:rPr>
-                <w:sz w:val="20"/>
-              </w:rPr>
-              <w:t>Member 5</w:t>
-            </w:r>
-          </w:p>
-        </w:tc>
-        <w:tc>
-          <w:tcPr>
-            <w:tcW w:type="dxa" w:w="1871"/>
-          </w:tcPr>
-          <w:p>
-            <w:r>
-              <w:rPr>
-                <w:sz w:val="20"/>
-              </w:rPr>
-              <w:t>[Student ID]</w:t>
-            </w:r>
-          </w:p>
-        </w:tc>
-        <w:tc>
-          <w:tcPr>
-            <w:tcW w:type="dxa" w:w="3685"/>
-          </w:tcPr>
-          <w:p>
-            <w:r>
-              <w:rPr>
-                <w:sz w:val="20"/>
-              </w:rPr>
-              <w:t>Documentation &amp; Presentation</w:t>
-            </w:r>
-          </w:p>
-        </w:tc>
-      </w:tr>
-    </w:tbl>
-    <w:p>
-      <w:pPr>
-        <w:spacing w:after="120" w:before="0"/>
-      </w:pPr>
-    </w:p>
-    <w:p>
-      <w:pPr>
-        <w:spacing w:after="200" w:before="0"/>
-      </w:pPr>
-    </w:p>
-    <w:p>
-      <w:pPr>
-        <w:spacing w:after="40" w:before="0"/>
-        <w:jc w:val="center"/>
-      </w:pPr>
-      <w:r>
-        <w:rPr>
-          <w:b w:val="0"/>
-          <w:i w:val="0"/>
-          <w:sz w:val="22"/>
-        </w:rPr>
-        <w:t>Course: Mobile Application Development        Semester: [Semester]</w:t>
       </w:r>
     </w:p>
     <w:p>
       <w:pPr>
-        <w:spacing w:after="40" w:before="0"/>
-        <w:jc w:val="center"/>
+        <w:spacing w:after="0" w:line="276" w:lineRule="auto"/>
+        <w:rPr>
+          <w:rFonts w:ascii="Arial" w:cs="Arial" w:eastAsia="Arial" w:hAnsi="Arial"/>
+          <w:b w:val="1"/>
+          <w:bCs w:val="1"/>
+          <w:sz w:val="24"/>
+          <w:szCs w:val="24"/>
+        </w:rPr>
       </w:pPr>
       <w:r>
         <w:rPr>
-          <w:b w:val="0"/>
-          <w:i w:val="0"/>
-          <w:sz w:val="22"/>
+          <w:rtl w:val="0"/>
         </w:rPr>
-        <w:t>Lecturer: [Lecturer Name]        Date: June 2026</w:t>
+      </w:r>
+    </w:p>
+    <w:p>
+      <w:pPr>
+        <w:spacing w:after="0" w:line="276" w:lineRule="auto"/>
+        <w:jc w:val="center"/>
+        <w:rPr>
+          <w:rFonts w:ascii="Arial" w:cs="Arial" w:eastAsia="Arial" w:hAnsi="Arial"/>
+          <w:b w:val="1"/>
+          <w:bCs w:val="1"/>
+          <w:sz w:val="24"/>
+          <w:szCs w:val="24"/>
+        </w:rPr>
+      </w:pPr>
+      <w:r>
+        <w:rPr>
+          <w:rFonts w:ascii="Arial" w:cs="Arial" w:eastAsia="Arial" w:hAnsi="Arial"/>
+          <w:b w:val="1"/>
+          <w:bCs w:val="1"/>
+          <w:sz w:val="24"/>
+          <w:szCs w:val="24"/>
+          <w:rtl w:val="0"/>
+        </w:rPr>
+        <w:t xml:space="preserve">LECTURER NAME:Dr. Ahmad Wiraputra bin Selamat</w:t>
+      </w:r>
+    </w:p>
+    <w:p>
+      <w:pPr>
+        <w:spacing w:after="200" w:before="0" w:lineRule="auto"/>
+        <w:rPr>
+          <w:b w:val="1"/>
+          <w:bCs w:val="1"/>
+          <w:color w:val="222222"/>
+          <w:sz w:val="36"/>
+          <w:szCs w:val="36"/>
+        </w:rPr>
+      </w:pPr>
+      <w:r>
+        <w:rPr>
+          <w:rtl w:val="0"/>
+        </w:rPr>
       </w:r>
     </w:p>
     <w:p>
@@ -637,7 +1523,7 @@
           <w:i w:val="0"/>
           <w:sz w:val="22"/>
         </w:rPr>
-        <w:t>Managing personal finances is a daily challenge for students and young working adults. Small, frequent purchases — a coffee here, a bus fare there — are easy to forget and quickly add up, making it difficult to understand where money actually goes each month. While many commercial finance apps exist, they are often cluttered with features, require account registration, or push the user's data to the cloud.</w:t>
+        <w:t>Managing personal finances is a daily challenge for students and young working adults. Small, frequent purchases — a coffee here, a bus fare there — are easy to forget and quickly add up, making it difficult to understand where money actually goes each month. While many commercial finance apps exist, they are often cluttered with features, ad-heavy, or hide the basics behind a paywall.</w:t>
       </w:r>
     </w:p>
     <w:p>
@@ -650,7 +1536,7 @@
           <w:i w:val="0"/>
           <w:sz w:val="22"/>
         </w:rPr>
-        <w:t>My Wallet is a lightweight personal expense tracker that solves this problem. It lets a user record income and expenses in seconds, review them grouped by day and month, visualise spending trends, and stay within a monthly budget — all while keeping every record stored privately on the device. The application was developed with Flutter, Google's cross-platform UI toolkit, allowing a single codebase to target Android, iOS, web and desktop.</w:t>
+        <w:t>My Wallet is a lightweight personal expense tracker that solves this problem. It lets a user record income and expenses in seconds, review them grouped by day and month, visualise spending trends, and stay within a monthly budget — all while storing every record in the cloud with Firebase so the data is safe and synced in realtime. The application was developed with Flutter, Google's cross-platform UI toolkit, allowing a single codebase to target Android, iOS and web.</w:t>
       </w:r>
     </w:p>
     <w:p>
@@ -694,7 +1580,7 @@
         <w:spacing w:after="60"/>
       </w:pPr>
       <w:r>
-        <w:t>Privacy-conscious users prefer their financial data to stay on their own device.</w:t>
+        <w:t>Users want their data backed up and synced across devices, not trapped on one phone.</w:t>
       </w:r>
     </w:p>
     <w:p>
@@ -738,7 +1624,7 @@
         <w:spacing w:after="60"/>
       </w:pPr>
       <w:r>
-        <w:t>To persist data locally so that records survive app restarts.</w:t>
+        <w:t>To persist data in a cloud database so records survive restarts and sync across devices.</w:t>
       </w:r>
     </w:p>
     <w:p>
@@ -768,7 +1654,7 @@
           <w:i w:val="0"/>
           <w:sz w:val="22"/>
         </w:rPr>
-        <w:t>The project covers a fully functional expense-tracking app with transaction management, monthly browsing, charts, budget tracking, and a profile/statistics page. The following are intentionally out of scope for this assignment: multi-user accounts, cloud synchronisation, bank integration, and online authentication. These are discussed as future enhancements in Section 10.</w:t>
+        <w:t>The project covers a fully functional expense-tracking app with transaction management, monthly browsing, charts, budget tracking, and a profile/statistics page. The following are intentionally out of scope for this assignment: multi-user accounts, bank integration, and user login/authentication. These are discussed as future enhancements in Section 10.</w:t>
       </w:r>
     </w:p>
     <w:p>
@@ -818,10 +1704,10 @@
         <w:rPr>
           <w:b/>
         </w:rPr>
-        <w:t xml:space="preserve">Privacy-minded users — </w:t>
+        <w:t xml:space="preserve">Anyone — </w:t>
       </w:r>
       <w:r>
-        <w:t>anyone who wants offline, on-device finance tracking.</w:t>
+        <w:t>who wants a simple, reliable tracker with their data safely in the cloud.</w:t>
       </w:r>
     </w:p>
     <w:p>
@@ -1110,10 +1996,10 @@
         <w:rPr>
           <w:b/>
         </w:rPr>
-        <w:t xml:space="preserve">Local persistence — </w:t>
+        <w:t xml:space="preserve">Cloud persistence — </w:t>
       </w:r>
       <w:r>
-        <w:t>all data is stored on-device with shared_preferences.</w:t>
+        <w:t>all data is stored in Cloud Firestore and synced in realtime.</w:t>
       </w:r>
     </w:p>
     <w:p>
@@ -1325,7 +2211,7 @@
               <w:rPr>
                 <w:sz w:val="20"/>
               </w:rPr>
-              <w:t>Storage</w:t>
+              <w:t>Database</w:t>
             </w:r>
           </w:p>
         </w:tc>
@@ -1338,7 +2224,7 @@
               <w:rPr>
                 <w:sz w:val="20"/>
               </w:rPr>
-              <w:t>shared_preferences ^2.3</w:t>
+              <w:t>cloud_firestore ^6.6</w:t>
             </w:r>
           </w:p>
         </w:tc>
@@ -1351,7 +2237,7 @@
               <w:rPr>
                 <w:sz w:val="20"/>
               </w:rPr>
-              <w:t>Local key/value persistence</w:t>
+              <w:t>Realtime cloud NoSQL database (CRUD)</w:t>
             </w:r>
           </w:p>
         </w:tc>
@@ -1366,7 +2252,7 @@
               <w:rPr>
                 <w:sz w:val="20"/>
               </w:rPr>
-              <w:t>Utilities</w:t>
+              <w:t>Backend</w:t>
             </w:r>
           </w:p>
         </w:tc>
@@ -1379,7 +2265,7 @@
               <w:rPr>
                 <w:sz w:val="20"/>
               </w:rPr>
-              <w:t>intl ^0.20</w:t>
+              <w:t>firebase_core ^4.11</w:t>
             </w:r>
           </w:p>
         </w:tc>
@@ -1392,7 +2278,7 @@
               <w:rPr>
                 <w:sz w:val="20"/>
               </w:rPr>
-              <w:t>Date and number formatting</w:t>
+              <w:t>Firebase initialisation</w:t>
             </w:r>
           </w:p>
         </w:tc>
@@ -1420,7 +2306,7 @@
               <w:rPr>
                 <w:sz w:val="20"/>
               </w:rPr>
-              <w:t>uuid ^4.5</w:t>
+              <w:t>intl ^0.20 · uuid ^4.5</w:t>
             </w:r>
           </w:p>
         </w:tc>
@@ -1433,7 +2319,7 @@
               <w:rPr>
                 <w:sz w:val="20"/>
               </w:rPr>
-              <w:t>Unique transaction IDs</w:t>
+              <w:t>Date/number formatting; unique IDs</w:t>
             </w:r>
           </w:p>
         </w:tc>
@@ -1502,7 +2388,7 @@
               <w:rPr>
                 <w:sz w:val="20"/>
               </w:rPr>
-              <w:t>flutter_test</w:t>
+              <w:t>flutter_test · fake_cloud_firestore</w:t>
             </w:r>
           </w:p>
         </w:tc>
@@ -1515,7 +2401,7 @@
               <w:rPr>
                 <w:sz w:val="20"/>
               </w:rPr>
-              <w:t>Unit and widget testing</w:t>
+              <w:t>Unit/widget tests with an in-memory Firestore</w:t>
             </w:r>
           </w:p>
         </w:tc>
@@ -1721,7 +2607,7 @@
                 <w:color w:val="1A1A1A"/>
                 <w:sz w:val="17"/>
               </w:rPr>
-              <w:t xml:space="preserve">            toJson()        |  fromJson()</w:t>
+              <w:t xml:space="preserve">            toMap()         |  fromMap()</w:t>
             </w:r>
           </w:p>
           <w:p>
@@ -1812,7 +2698,7 @@
                 <w:color w:val="1A1A1A"/>
                 <w:sz w:val="17"/>
               </w:rPr>
-              <w:t xml:space="preserve">  |   Storage Layer  (SharedPreferences)            |</w:t>
+              <w:t xml:space="preserve">  |   Storage Layer  (Cloud Firestore)              |</w:t>
             </w:r>
           </w:p>
           <w:p>
@@ -1898,7 +2784,20 @@
                 <w:color w:val="1A1A1A"/>
                 <w:sz w:val="17"/>
               </w:rPr>
-              <w:t xml:space="preserve">  main.dart                     # App entry, theme, Provider injection</w:t>
+              <w:t xml:space="preserve">  main.dart                     # App entry, Firebase init, Provider injection</w:t>
+            </w:r>
+          </w:p>
+          <w:p>
+            <w:pPr>
+              <w:spacing w:after="0" w:line="240" w:lineRule="auto"/>
+            </w:pPr>
+            <w:r>
+              <w:rPr>
+                <w:rFonts w:ascii="Consolas" w:hAnsi="Consolas"/>
+                <w:color w:val="1A1A1A"/>
+                <w:sz w:val="17"/>
+              </w:rPr>
+              <w:t xml:space="preserve">  firebase_options.dart         # Firebase project config (web)</w:t>
             </w:r>
           </w:p>
           <w:p>
@@ -2171,7 +3070,7 @@
           <w:i w:val="0"/>
           <w:sz w:val="22"/>
         </w:rPr>
-        <w:t>The core data structure is the Transaction class. Each transaction stores an id, title, amount, category, date, type and note. Two enums — TransactionType (income / expense) and Category (food, transport, shopping, etc.) — keep the data type-safe. The model includes toMap/fromMap and toJson/fromJson methods so it can be serialised to and from the local store.</w:t>
+        <w:t>The core data structure is the Transaction class. Each transaction stores an id, title, amount, category, date, type and note. Two enums — TransactionType (income / expense) and Category (food, transport, shopping, etc.) — keep the data type-safe. The model includes toMap/fromMap and toJson/fromJson methods so it can be serialised to and from Cloud Firestore.</w:t>
       </w:r>
     </w:p>
     <w:tbl>
@@ -2655,7 +3554,7 @@
           <w:i w:val="0"/>
           <w:sz w:val="22"/>
         </w:rPr>
-        <w:t>Persistence is handled by shared_preferences. The full list of transactions is stored as a list of JSON strings under a single key. On startup the provider loads and decodes this list; after every add, update or delete it re-encodes and saves. This approach is simple, dependency-light and perfectly adequate for the data volumes of a personal tracker.</w:t>
+        <w:t>Persistence is handled by Cloud Firestore. Each transaction is stored as a document in the transactions collection (keyed by its id), and the monthly budget lives in settings/app. A realtime snapshot listener streams changes back to the app, so the in-memory list — and therefore the UI — updates the moment data changes, on this device or any other.</w:t>
       </w:r>
     </w:p>
     <w:tbl>
@@ -2689,7 +3588,7 @@
                 <w:color w:val="1A1A1A"/>
                 <w:sz w:val="17"/>
               </w:rPr>
-              <w:t>Future&lt;void&gt; _save() async {</w:t>
+              <w:t>// Realtime read: listen to the collection</w:t>
             </w:r>
           </w:p>
           <w:p>
@@ -2702,7 +3601,7 @@
                 <w:color w:val="1A1A1A"/>
                 <w:sz w:val="17"/>
               </w:rPr>
-              <w:t xml:space="preserve">  final prefs = await SharedPreferences.getInstance();</w:t>
+              <w:t>_txCol.snapshots().listen((snapshot) {</w:t>
             </w:r>
           </w:p>
           <w:p>
@@ -2715,7 +3614,7 @@
                 <w:color w:val="1A1A1A"/>
                 <w:sz w:val="17"/>
               </w:rPr>
-              <w:t xml:space="preserve">  await prefs.setStringList(</w:t>
+              <w:t xml:space="preserve">  _transactions = snapshot.docs</w:t>
             </w:r>
           </w:p>
           <w:p>
@@ -2728,7 +3627,7 @@
                 <w:color w:val="1A1A1A"/>
                 <w:sz w:val="17"/>
               </w:rPr>
-              <w:t xml:space="preserve">    'transactions',</w:t>
+              <w:t xml:space="preserve">      .map((d) =&gt; Transaction.fromMap(d.data()))</w:t>
             </w:r>
           </w:p>
           <w:p>
@@ -2741,7 +3640,7 @@
                 <w:color w:val="1A1A1A"/>
                 <w:sz w:val="17"/>
               </w:rPr>
-              <w:t xml:space="preserve">    _transactions.map((t) =&gt; t.toJson()).toList(),</w:t>
+              <w:t xml:space="preserve">      .toList();</w:t>
             </w:r>
           </w:p>
           <w:p>
@@ -2754,7 +3653,7 @@
                 <w:color w:val="1A1A1A"/>
                 <w:sz w:val="17"/>
               </w:rPr>
-              <w:t xml:space="preserve">  );</w:t>
+              <w:t xml:space="preserve">  notifyListeners();</w:t>
             </w:r>
           </w:p>
           <w:p>
@@ -2767,7 +3666,46 @@
                 <w:color w:val="1A1A1A"/>
                 <w:sz w:val="17"/>
               </w:rPr>
-              <w:t>}</w:t>
+              <w:t>});</w:t>
+            </w:r>
+          </w:p>
+          <w:p>
+            <w:pPr>
+              <w:spacing w:after="0" w:line="240" w:lineRule="auto"/>
+            </w:pPr>
+            <w:r>
+              <w:rPr>
+                <w:rFonts w:ascii="Consolas" w:hAnsi="Consolas"/>
+                <w:color w:val="1A1A1A"/>
+                <w:sz w:val="17"/>
+              </w:rPr>
+              <w:t xml:space="preserve"> </w:t>
+            </w:r>
+          </w:p>
+          <w:p>
+            <w:pPr>
+              <w:spacing w:after="0" w:line="240" w:lineRule="auto"/>
+            </w:pPr>
+            <w:r>
+              <w:rPr>
+                <w:rFonts w:ascii="Consolas" w:hAnsi="Consolas"/>
+                <w:color w:val="1A1A1A"/>
+                <w:sz w:val="17"/>
+              </w:rPr>
+              <w:t>// Create / Update: write one document</w:t>
+            </w:r>
+          </w:p>
+          <w:p>
+            <w:pPr>
+              <w:spacing w:after="0" w:line="240" w:lineRule="auto"/>
+            </w:pPr>
+            <w:r>
+              <w:rPr>
+                <w:rFonts w:ascii="Consolas" w:hAnsi="Consolas"/>
+                <w:color w:val="1A1A1A"/>
+                <w:sz w:val="17"/>
+              </w:rPr>
+              <w:t>await _txCol.doc(t.id).set(t.toMap());</w:t>
             </w:r>
           </w:p>
         </w:tc>
@@ -2785,7 +3723,7 @@
           <w:color w:val="666666"/>
           <w:sz w:val="18"/>
         </w:rPr>
-        <w:t>Listing 3: Saving transactions to local storage.</w:t>
+        <w:t>Listing 3: Reading and writing with Cloud Firestore.</w:t>
       </w:r>
     </w:p>
     <w:p>
@@ -3692,7 +4630,7 @@
           <w:i w:val="0"/>
           <w:sz w:val="22"/>
         </w:rPr>
-        <w:t>All four CRUD operations are implemented inside TransactionProvider and are triggered from the UI. Each operation mutates the in-memory list, persists the change, and calls notifyListeners() so the UI refreshes automatically.</w:t>
+        <w:t>All four CRUD operations are implemented inside TransactionProvider and are triggered from the UI. Create, update and delete write directly to Cloud Firestore; a realtime snapshot listener then receives the change, refreshes the in-memory list, and calls notifyListeners() so the UI updates automatically.</w:t>
       </w:r>
     </w:p>
     <w:p>
@@ -3760,33 +4698,7 @@
                 <w:color w:val="1A1A1A"/>
                 <w:sz w:val="17"/>
               </w:rPr>
-              <w:t xml:space="preserve">  _transactions.add(t);</w:t>
-            </w:r>
-          </w:p>
-          <w:p>
-            <w:pPr>
-              <w:spacing w:after="0" w:line="240" w:lineRule="auto"/>
-            </w:pPr>
-            <w:r>
-              <w:rPr>
-                <w:rFonts w:ascii="Consolas" w:hAnsi="Consolas"/>
-                <w:color w:val="1A1A1A"/>
-                <w:sz w:val="17"/>
-              </w:rPr>
-              <w:t xml:space="preserve">  await _save();</w:t>
-            </w:r>
-          </w:p>
-          <w:p>
-            <w:pPr>
-              <w:spacing w:after="0" w:line="240" w:lineRule="auto"/>
-            </w:pPr>
-            <w:r>
-              <w:rPr>
-                <w:rFonts w:ascii="Consolas" w:hAnsi="Consolas"/>
-                <w:color w:val="1A1A1A"/>
-                <w:sz w:val="17"/>
-              </w:rPr>
-              <w:t xml:space="preserve">  notifyListeners();</w:t>
+              <w:t xml:space="preserve">  await _txCol.doc(t.id).set(t.toMap());</w:t>
             </w:r>
           </w:p>
           <w:p>
@@ -3817,7 +4729,7 @@
           <w:color w:val="666666"/>
           <w:sz w:val="18"/>
         </w:rPr>
-        <w:t>Listing 4: Create operation.</w:t>
+        <w:t>Listing 4: Create operation (writes a Firestore document).</w:t>
       </w:r>
     </w:p>
     <w:p>
@@ -4010,72 +4922,7 @@
                 <w:color w:val="1A1A1A"/>
                 <w:sz w:val="17"/>
               </w:rPr>
-              <w:t xml:space="preserve">  final i = _transactions.indexWhere((x) =&gt; x.id == t.id);</w:t>
-            </w:r>
-          </w:p>
-          <w:p>
-            <w:pPr>
-              <w:spacing w:after="0" w:line="240" w:lineRule="auto"/>
-            </w:pPr>
-            <w:r>
-              <w:rPr>
-                <w:rFonts w:ascii="Consolas" w:hAnsi="Consolas"/>
-                <w:color w:val="1A1A1A"/>
-                <w:sz w:val="17"/>
-              </w:rPr>
-              <w:t xml:space="preserve">  if (i != -1) {</w:t>
-            </w:r>
-          </w:p>
-          <w:p>
-            <w:pPr>
-              <w:spacing w:after="0" w:line="240" w:lineRule="auto"/>
-            </w:pPr>
-            <w:r>
-              <w:rPr>
-                <w:rFonts w:ascii="Consolas" w:hAnsi="Consolas"/>
-                <w:color w:val="1A1A1A"/>
-                <w:sz w:val="17"/>
-              </w:rPr>
-              <w:t xml:space="preserve">    _transactions[i] = t;</w:t>
-            </w:r>
-          </w:p>
-          <w:p>
-            <w:pPr>
-              <w:spacing w:after="0" w:line="240" w:lineRule="auto"/>
-            </w:pPr>
-            <w:r>
-              <w:rPr>
-                <w:rFonts w:ascii="Consolas" w:hAnsi="Consolas"/>
-                <w:color w:val="1A1A1A"/>
-                <w:sz w:val="17"/>
-              </w:rPr>
-              <w:t xml:space="preserve">    await _save();</w:t>
-            </w:r>
-          </w:p>
-          <w:p>
-            <w:pPr>
-              <w:spacing w:after="0" w:line="240" w:lineRule="auto"/>
-            </w:pPr>
-            <w:r>
-              <w:rPr>
-                <w:rFonts w:ascii="Consolas" w:hAnsi="Consolas"/>
-                <w:color w:val="1A1A1A"/>
-                <w:sz w:val="17"/>
-              </w:rPr>
-              <w:t xml:space="preserve">    notifyListeners();</w:t>
-            </w:r>
-          </w:p>
-          <w:p>
-            <w:pPr>
-              <w:spacing w:after="0" w:line="240" w:lineRule="auto"/>
-            </w:pPr>
-            <w:r>
-              <w:rPr>
-                <w:rFonts w:ascii="Consolas" w:hAnsi="Consolas"/>
-                <w:color w:val="1A1A1A"/>
-                <w:sz w:val="17"/>
-              </w:rPr>
-              <w:t xml:space="preserve">  }</w:t>
+              <w:t xml:space="preserve">  await _txCol.doc(t.id).set(t.toMap());</w:t>
             </w:r>
           </w:p>
           <w:p>
@@ -4106,7 +4953,7 @@
           <w:color w:val="666666"/>
           <w:sz w:val="18"/>
         </w:rPr>
-        <w:t>Listing 6: Update operation.</w:t>
+        <w:t>Listing 6: Update operation (overwrites the document).</w:t>
       </w:r>
     </w:p>
     <w:p>
@@ -4174,33 +5021,7 @@
                 <w:color w:val="1A1A1A"/>
                 <w:sz w:val="17"/>
               </w:rPr>
-              <w:t xml:space="preserve">  _transactions.removeWhere((t) =&gt; t.id == id);</w:t>
-            </w:r>
-          </w:p>
-          <w:p>
-            <w:pPr>
-              <w:spacing w:after="0" w:line="240" w:lineRule="auto"/>
-            </w:pPr>
-            <w:r>
-              <w:rPr>
-                <w:rFonts w:ascii="Consolas" w:hAnsi="Consolas"/>
-                <w:color w:val="1A1A1A"/>
-                <w:sz w:val="17"/>
-              </w:rPr>
-              <w:t xml:space="preserve">  await _save();</w:t>
-            </w:r>
-          </w:p>
-          <w:p>
-            <w:pPr>
-              <w:spacing w:after="0" w:line="240" w:lineRule="auto"/>
-            </w:pPr>
-            <w:r>
-              <w:rPr>
-                <w:rFonts w:ascii="Consolas" w:hAnsi="Consolas"/>
-                <w:color w:val="1A1A1A"/>
-                <w:sz w:val="17"/>
-              </w:rPr>
-              <w:t xml:space="preserve">  notifyListeners();</w:t>
+              <w:t xml:space="preserve">  await _txCol.doc(id).delete();</w:t>
             </w:r>
           </w:p>
           <w:p>
@@ -4231,7 +5052,7 @@
           <w:color w:val="666666"/>
           <w:sz w:val="18"/>
         </w:rPr>
-        <w:t>Listing 7: Delete operation.</w:t>
+        <w:t>Listing 7: Delete operation (removes the document).</w:t>
       </w:r>
     </w:p>
     <w:p>
@@ -4316,7 +5137,7 @@
         <w:t xml:space="preserve">transaction_provider_test.dart — </w:t>
       </w:r>
       <w:r>
-        <w:t>add, update, delete, clearAll, setBudget, and the income/expense/balance getters.</w:t>
+        <w:t>add, update, delete, clearAll, setBudget and the income/expense/balance getters, run against an in-memory fake_cloud_firestore (no real Firebase connection needed).</w:t>
       </w:r>
     </w:p>
     <w:p>
@@ -4331,7 +5152,7 @@
         <w:t xml:space="preserve">widget_test.dart — </w:t>
       </w:r>
       <w:r>
-        <w:t>a smoke test that builds the app and verifies the bottom navigation renders.</w:t>
+        <w:t>a smoke test that verifies the bottom navigation renders.</w:t>
       </w:r>
     </w:p>
     <w:p>
@@ -4344,7 +5165,7 @@
           <w:i w:val="0"/>
           <w:sz w:val="22"/>
         </w:rPr>
-        <w:t>All 11 automated tests pass, as summarised below.</w:t>
+        <w:t>All 12 automated tests pass, as summarised below.</w:t>
       </w:r>
     </w:p>
     <w:tbl>
@@ -4838,7 +5659,7 @@
               <w:rPr>
                 <w:sz w:val="20"/>
               </w:rPr>
-              <w:t>update() replaces matching record</w:t>
+              <w:t>add() persists to Firestore collection</w:t>
             </w:r>
           </w:p>
         </w:tc>
@@ -4901,7 +5722,7 @@
               <w:rPr>
                 <w:sz w:val="20"/>
               </w:rPr>
-              <w:t>delete() removes matching record</w:t>
+              <w:t>update() replaces matching record</w:t>
             </w:r>
           </w:p>
         </w:tc>
@@ -4964,7 +5785,7 @@
               <w:rPr>
                 <w:sz w:val="20"/>
               </w:rPr>
-              <w:t>clearAll() empties the ledger</w:t>
+              <w:t>delete() removes matching record</w:t>
             </w:r>
           </w:p>
         </w:tc>
@@ -5027,7 +5848,7 @@
               <w:rPr>
                 <w:sz w:val="20"/>
               </w:rPr>
-              <w:t>setBudget() stores the budget</w:t>
+              <w:t>clearAll() empties the ledger</w:t>
             </w:r>
           </w:p>
         </w:tc>
@@ -5078,6 +5899,69 @@
                 <w:sz w:val="20"/>
               </w:rPr>
               <w:t>11</w:t>
+            </w:r>
+          </w:p>
+        </w:tc>
+        <w:tc>
+          <w:tcPr>
+            <w:tcW w:type="dxa" w:w="4819"/>
+          </w:tcPr>
+          <w:p>
+            <w:r>
+              <w:rPr>
+                <w:sz w:val="20"/>
+              </w:rPr>
+              <w:t>setBudget() stores the budget</w:t>
+            </w:r>
+          </w:p>
+        </w:tc>
+        <w:tc>
+          <w:tcPr>
+            <w:tcW w:type="dxa" w:w="1701"/>
+          </w:tcPr>
+          <w:p>
+            <w:pPr>
+              <w:jc w:val="center"/>
+            </w:pPr>
+            <w:r>
+              <w:rPr>
+                <w:sz w:val="20"/>
+              </w:rPr>
+              <w:t>Unit</w:t>
+            </w:r>
+          </w:p>
+        </w:tc>
+        <w:tc>
+          <w:tcPr>
+            <w:tcW w:type="dxa" w:w="1984"/>
+          </w:tcPr>
+          <w:p>
+            <w:pPr>
+              <w:jc w:val="center"/>
+            </w:pPr>
+            <w:r>
+              <w:rPr>
+                <w:sz w:val="20"/>
+              </w:rPr>
+              <w:t>Pass</w:t>
+            </w:r>
+          </w:p>
+        </w:tc>
+      </w:tr>
+      <w:tr>
+        <w:tc>
+          <w:tcPr>
+            <w:tcW w:type="dxa" w:w="567"/>
+          </w:tcPr>
+          <w:p>
+            <w:pPr>
+              <w:jc w:val="center"/>
+            </w:pPr>
+            <w:r>
+              <w:rPr>
+                <w:sz w:val="20"/>
+              </w:rPr>
+              <w:t>12</w:t>
             </w:r>
           </w:p>
         </w:tc>
@@ -5177,7 +6061,7 @@
                 <w:color w:val="1A1A1A"/>
                 <w:sz w:val="17"/>
               </w:rPr>
-              <w:t>00:00 +11: All tests passed!</w:t>
+              <w:t>00:01 +12: All tests passed!</w:t>
             </w:r>
           </w:p>
         </w:tc>
@@ -5692,7 +6576,7 @@
               <w:rPr>
                 <w:sz w:val="19"/>
               </w:rPr>
-              <w:t>All records persist (loaded from storage)</w:t>
+              <w:t>All records persist (reloaded from Firestore)</w:t>
             </w:r>
           </w:p>
         </w:tc>
@@ -5753,6 +6637,66 @@
                 <w:sz w:val="19"/>
               </w:rPr>
               <w:t>Ledger is emptied after confirmation</w:t>
+            </w:r>
+          </w:p>
+        </w:tc>
+        <w:tc>
+          <w:tcPr>
+            <w:tcW w:type="dxa" w:w="1417"/>
+          </w:tcPr>
+          <w:p>
+            <w:pPr>
+              <w:jc w:val="center"/>
+            </w:pPr>
+            <w:r>
+              <w:rPr>
+                <w:sz w:val="19"/>
+              </w:rPr>
+              <w:t>Pass</w:t>
+            </w:r>
+          </w:p>
+        </w:tc>
+      </w:tr>
+      <w:tr>
+        <w:tc>
+          <w:tcPr>
+            <w:tcW w:type="dxa" w:w="567"/>
+          </w:tcPr>
+          <w:p>
+            <w:pPr>
+              <w:jc w:val="center"/>
+            </w:pPr>
+            <w:r>
+              <w:rPr>
+                <w:sz w:val="19"/>
+              </w:rPr>
+              <w:t>M9</w:t>
+            </w:r>
+          </w:p>
+        </w:tc>
+        <w:tc>
+          <w:tcPr>
+            <w:tcW w:type="dxa" w:w="2721"/>
+          </w:tcPr>
+          <w:p>
+            <w:r>
+              <w:rPr>
+                <w:sz w:val="19"/>
+              </w:rPr>
+              <w:t>Check the Firebase console</w:t>
+            </w:r>
+          </w:p>
+        </w:tc>
+        <w:tc>
+          <w:tcPr>
+            <w:tcW w:type="dxa" w:w="4365"/>
+          </w:tcPr>
+          <w:p>
+            <w:r>
+              <w:rPr>
+                <w:sz w:val="19"/>
+              </w:rPr>
+              <w:t>Records appear in the transactions collection in realtime</w:t>
             </w:r>
           </w:p>
         </w:tc>
@@ -5997,7 +6941,7 @@
       <w:tr>
         <w:tc>
           <w:tcPr>
-            <w:tcW w:type="dxa" w:w="1474"/>
+            <w:tcW w:type="dxa" w:w="2268"/>
             <w:shd w:val="clear" w:color="auto" w:fill="FFF3CD"/>
           </w:tcPr>
           <w:p>
@@ -6015,7 +6959,7 @@
         </w:tc>
         <w:tc>
           <w:tcPr>
-            <w:tcW w:type="dxa" w:w="5896"/>
+            <w:tcW w:type="dxa" w:w="5102"/>
             <w:shd w:val="clear" w:color="auto" w:fill="FFF3CD"/>
           </w:tcPr>
           <w:p>
@@ -6053,27 +6997,27 @@
       <w:tr>
         <w:tc>
           <w:tcPr>
-            <w:tcW w:type="dxa" w:w="1474"/>
+            <w:tcW w:type="dxa" w:w="2268"/>
           </w:tcPr>
           <w:p>
             <w:r>
               <w:rPr>
                 <w:sz w:val="20"/>
               </w:rPr>
-              <w:t>Member 1</w:t>
+              <w:t>Sazit Ul Islam</w:t>
             </w:r>
           </w:p>
         </w:tc>
         <w:tc>
           <w:tcPr>
-            <w:tcW w:type="dxa" w:w="5896"/>
+            <w:tcW w:type="dxa" w:w="5102"/>
           </w:tcPr>
           <w:p>
             <w:r>
               <w:rPr>
                 <w:sz w:val="20"/>
               </w:rPr>
-              <w:t>Project coordination; data model and TransactionProvider (state management, CRUD, persistence).</w:t>
+              <w:t>Project coordination; data model and TransactionProvider (state management, CRUD, Firestore persistence).</w:t>
             </w:r>
           </w:p>
         </w:tc>
@@ -6097,20 +7041,22 @@
       <w:tr>
         <w:tc>
           <w:tcPr>
-            <w:tcW w:type="dxa" w:w="1474"/>
+            <w:tcW w:type="dxa" w:w="2268"/>
           </w:tcPr>
           <w:p>
             <w:r>
               <w:rPr>
                 <w:sz w:val="20"/>
               </w:rPr>
-              <w:t>Member 2</w:t>
+              <w:t>Nur Aisyatul Najwa</w:t>
+              <w:br/>
+              <w:t>binti Mohamad Nasir</w:t>
             </w:r>
           </w:p>
         </w:tc>
         <w:tc>
           <w:tcPr>
-            <w:tcW w:type="dxa" w:w="5896"/>
+            <w:tcW w:type="dxa" w:w="5102"/>
           </w:tcPr>
           <w:p>
             <w:r>
@@ -6141,20 +7087,22 @@
       <w:tr>
         <w:tc>
           <w:tcPr>
-            <w:tcW w:type="dxa" w:w="1474"/>
+            <w:tcW w:type="dxa" w:w="2268"/>
           </w:tcPr>
           <w:p>
             <w:r>
               <w:rPr>
                 <w:sz w:val="20"/>
               </w:rPr>
-              <w:t>Member 3</w:t>
+              <w:t>Nurfatin Aqilah</w:t>
+              <w:br/>
+              <w:t>binti Zolkifli</w:t>
             </w:r>
           </w:p>
         </w:tc>
         <w:tc>
           <w:tcPr>
-            <w:tcW w:type="dxa" w:w="5896"/>
+            <w:tcW w:type="dxa" w:w="5102"/>
           </w:tcPr>
           <w:p>
             <w:r>
@@ -6185,27 +7133,27 @@
       <w:tr>
         <w:tc>
           <w:tcPr>
-            <w:tcW w:type="dxa" w:w="1474"/>
+            <w:tcW w:type="dxa" w:w="2268"/>
           </w:tcPr>
           <w:p>
             <w:r>
               <w:rPr>
                 <w:sz w:val="20"/>
               </w:rPr>
-              <w:t>Member 4</w:t>
+              <w:t>Shi Kaiyan</w:t>
             </w:r>
           </w:p>
         </w:tc>
         <w:tc>
           <w:tcPr>
-            <w:tcW w:type="dxa" w:w="5896"/>
+            <w:tcW w:type="dxa" w:w="5102"/>
           </w:tcPr>
           <w:p>
             <w:r>
               <w:rPr>
                 <w:sz w:val="20"/>
               </w:rPr>
-              <w:t>Discover (budget) and Profile screens; persistence wiring; automated tests.</w:t>
+              <w:t>Discover (budget) and Profile screens; Firebase/Firestore wiring; automated tests.</w:t>
             </w:r>
           </w:p>
         </w:tc>
@@ -6229,20 +7177,22 @@
       <w:tr>
         <w:tc>
           <w:tcPr>
-            <w:tcW w:type="dxa" w:w="1474"/>
+            <w:tcW w:type="dxa" w:w="2268"/>
           </w:tcPr>
           <w:p>
             <w:r>
               <w:rPr>
                 <w:sz w:val="20"/>
               </w:rPr>
-              <w:t>Member 5</w:t>
+              <w:t>Mst Samiya Haque</w:t>
+              <w:br/>
+              <w:t>Kotha</w:t>
             </w:r>
           </w:p>
         </w:tc>
         <w:tc>
           <w:tcPr>
-            <w:tcW w:type="dxa" w:w="5896"/>
+            <w:tcW w:type="dxa" w:w="5102"/>
           </w:tcPr>
           <w:p>
             <w:r>
@@ -6287,7 +7237,7 @@
           <w:color w:val="666666"/>
           <w:sz w:val="18"/>
         </w:rPr>
-        <w:t>Note: Replace the placeholder names and adjust the contribution split to reflect your group's actual work.</w:t>
+        <w:t>Lecturer: Dr. Ahmad Wiraputra bin Selamat. Every member contributed across design, development, testing and documentation.</w:t>
       </w:r>
     </w:p>
     <w:p>
@@ -6390,7 +7340,7 @@
               <w:rPr>
                 <w:sz w:val="20"/>
               </w:rPr>
-              <w:t>Persisting structured data with a lightweight dependency.</w:t>
+              <w:t>Storing data in a real cloud database with live updates.</w:t>
             </w:r>
           </w:p>
         </w:tc>
@@ -6403,7 +7353,7 @@
               <w:rPr>
                 <w:sz w:val="20"/>
               </w:rPr>
-              <w:t>Serialised each Transaction to JSON and stored the list with shared_preferences, avoiding a full database.</w:t>
+              <w:t>Used Cloud Firestore — one document per transaction — with a snapshot listener so the UI updates instantly and data syncs across devices.</w:t>
             </w:r>
           </w:p>
         </w:tc>
@@ -6524,7 +7474,7 @@
           <w:i w:val="0"/>
           <w:sz w:val="22"/>
         </w:rPr>
-        <w:t>My Wallet successfully meets all of the assignment's functional requirements. It delivers complete CRUD functionality, a clean and responsive Material 3 interface, Provider-based local state management, and on-device persistence. Building the app gave the team hands-on experience with Flutter, the Provider pattern, automated testing, and collaborative development with Git and GitHub.</w:t>
+        <w:t>My Wallet successfully meets all of the assignment's functional requirements. It delivers complete CRUD functionality, a clean and responsive Material 3 interface, Provider-based state management, and realtime cloud persistence with Cloud Firestore. Building the app gave the team hands-on experience with Flutter, Firebase, the Provider pattern, automated testing, and collaborative development with Git and GitHub.</w:t>
       </w:r>
     </w:p>
     <w:p>
@@ -6541,7 +7491,7 @@
         <w:spacing w:after="60"/>
       </w:pPr>
       <w:r>
-        <w:t>Cloud sync and multi-device support via a backend or Firebase.</w:t>
+        <w:t>User accounts with secure authentication (Firebase Auth).</w:t>
       </w:r>
     </w:p>
     <w:p>
@@ -6550,7 +7500,7 @@
         <w:spacing w:after="60"/>
       </w:pPr>
       <w:r>
-        <w:t>Optional user accounts with secure authentication.</w:t>
+        <w:t>Production-grade Firestore security rules (per-user data isolation).</w:t>
       </w:r>
     </w:p>
     <w:p>
@@ -6559,7 +7509,7 @@
         <w:spacing w:after="60"/>
       </w:pPr>
       <w:r>
-        <w:t>Export to CSV/PDF and receipt photo attachments.</w:t>
+        <w:t>Offline caching so the app works smoothly with a poor connection.</w:t>
       </w:r>
     </w:p>
     <w:p>
@@ -6568,7 +7518,16 @@
         <w:spacing w:after="60"/>
       </w:pPr>
       <w:r>
-        <w:t>Recurring transactions and bill reminders (notifications).</w:t>
+        <w:t>Export to CSV/PDF and receipt photo attachments (Firebase Storage).</w:t>
+      </w:r>
+    </w:p>
+    <w:p>
+      <w:pPr>
+        <w:pStyle w:val="ListBullet"/>
+        <w:spacing w:after="60"/>
+      </w:pPr>
+      <w:r>
+        <w:t>Recurring transactions and bill reminders (push notifications).</w:t>
       </w:r>
     </w:p>
     <w:p>
@@ -6578,15 +7537,6 @@
       </w:pPr>
       <w:r>
         <w:t>Dark mode and multiple-currency support.</w:t>
-      </w:r>
-    </w:p>
-    <w:p>
-      <w:pPr>
-        <w:pStyle w:val="ListBullet"/>
-        <w:spacing w:after="60"/>
-      </w:pPr>
-      <w:r>
-        <w:t>Migrating storage from shared_preferences to a SQLite database (sqflite/drift) for larger data volumes and richer queries.</w:t>
       </w:r>
     </w:p>
     <w:p>
@@ -6630,7 +7580,16 @@
         <w:spacing w:after="60"/>
       </w:pPr>
       <w:r>
-        <w:t>shared_preferences package. https://pub.dev/packages/shared_preferences</w:t>
+        <w:t>Cloud Firestore (FlutterFire). https://firebase.flutter.dev/docs/firestore/overview</w:t>
+      </w:r>
+    </w:p>
+    <w:p>
+      <w:pPr>
+        <w:pStyle w:val="ListNumber"/>
+        <w:spacing w:after="60"/>
+      </w:pPr>
+      <w:r>
+        <w:t>Firebase Documentation. https://firebase.google.com/docs</w:t>
       </w:r>
     </w:p>
     <w:p>

</xml_diff>

<commit_message>
Remove Profile screen; bottom nav now four equal-width tabs
- Delete profile_screen.dart and its "My" nav entry
- main_screen.dart: bottom nav = Ledger / Charts / Record / Discover (flat, equal width)
- Update navigation smoke test (My -> Discover)
- Report: drop all Profile references, four-tab nav, keep original cover page,
  embed app screenshots in figures and appendix
- Add docs/screenshots/ and docs/upsi_logo.png assets used by build_report.py
</commit_message>
<xml_diff>
--- a/docs/My_Wallet_Project_Report.docx
+++ b/docs/My_Wallet_Project_Report.docx
@@ -27,7 +27,7 @@
                     <pic:cNvPicPr preferRelativeResize="0"/>
                   </pic:nvPicPr>
                   <pic:blipFill>
-                    <a:blip r:embed="rId10"/>
+                    <a:blip r:embed="rId9"/>
                     <a:srcRect b="19999" l="0" r="0" t="15416"/>
                     <a:stretch>
                       <a:fillRect/>
@@ -79,7 +79,7 @@
           <w:szCs w:val="26"/>
         </w:rPr>
       </w:pPr>
-      <w:bookmarkStart w:colFirst="0" w:colLast="0" w:name="_5t96kcpcnja2" w:id="0"/>
+      <w:bookmarkStart w:colFirst="0" w:colLast="0" w:name="_uvcaus4rbhia" w:id="0"/>
       <w:bookmarkEnd w:id="0"/>
       <w:r>
         <w:rPr>
@@ -99,7 +99,7 @@
           <w:szCs w:val="26"/>
         </w:rPr>
       </w:pPr>
-      <w:bookmarkStart w:colFirst="0" w:colLast="0" w:name="_pnm6f8uwh88j" w:id="1"/>
+      <w:bookmarkStart w:colFirst="0" w:colLast="0" w:name="_m4s6v7jscif0" w:id="1"/>
       <w:bookmarkEnd w:id="1"/>
       <w:r>
         <w:rPr>
@@ -125,7 +125,7 @@
           <w:szCs w:val="26"/>
         </w:rPr>
       </w:pPr>
-      <w:bookmarkStart w:colFirst="0" w:colLast="0" w:name="_7wo2lpxnmuxo" w:id="2"/>
+      <w:bookmarkStart w:colFirst="0" w:colLast="0" w:name="_m0hb0mnis3no" w:id="2"/>
       <w:bookmarkEnd w:id="2"/>
       <w:r>
         <w:rPr>
@@ -145,7 +145,7 @@
           <w:szCs w:val="26"/>
         </w:rPr>
       </w:pPr>
-      <w:bookmarkStart w:colFirst="0" w:colLast="0" w:name="_8174lkwvgjvq" w:id="3"/>
+      <w:bookmarkStart w:colFirst="0" w:colLast="0" w:name="_tsax4zb4w496" w:id="3"/>
       <w:bookmarkEnd w:id="3"/>
       <w:r>
         <w:rPr>
@@ -165,7 +165,7 @@
           <w:szCs w:val="26"/>
         </w:rPr>
       </w:pPr>
-      <w:bookmarkStart w:colFirst="0" w:colLast="0" w:name="_1c989yuzrbws" w:id="4"/>
+      <w:bookmarkStart w:colFirst="0" w:colLast="0" w:name="_ipds193mtcls" w:id="4"/>
       <w:bookmarkEnd w:id="4"/>
       <w:r>
         <w:rPr>
@@ -953,8 +953,12 @@
             </w:pPr>
             <w:r>
               <w:rPr>
+                <w:rFonts w:ascii="Arial" w:cs="Arial" w:eastAsia="Arial" w:hAnsi="Arial"/>
+                <w:sz w:val="20"/>
+                <w:szCs w:val="20"/>
                 <w:rtl w:val="0"/>
               </w:rPr>
+              <w:t xml:space="preserve">D20231109009</w:t>
             </w:r>
           </w:p>
         </w:tc>
@@ -1352,8 +1356,12 @@
             </w:pPr>
             <w:r>
               <w:rPr>
+                <w:rFonts w:ascii="Arial" w:cs="Arial" w:eastAsia="Arial" w:hAnsi="Arial"/>
+                <w:sz w:val="20"/>
+                <w:szCs w:val="20"/>
                 <w:rtl w:val="0"/>
               </w:rPr>
+              <w:t xml:space="preserve">D20231109010</w:t>
             </w:r>
           </w:p>
         </w:tc>
@@ -1452,8 +1460,16 @@
       </w:r>
     </w:p>
     <w:p>
+      <w:pPr>
+        <w:rPr/>
+      </w:pPr>
       <w:r>
         <w:br w:type="page"/>
+      </w:r>
+      <w:r>
+        <w:rPr>
+          <w:rtl w:val="0"/>
+        </w:rPr>
       </w:r>
     </w:p>
     <w:p>
@@ -1654,7 +1670,7 @@
           <w:i w:val="0"/>
           <w:sz w:val="22"/>
         </w:rPr>
-        <w:t>The project covers a fully functional expense-tracking app with transaction management, monthly browsing, charts, budget tracking, and a profile/statistics page. The following are intentionally out of scope for this assignment: multi-user accounts, bank integration, and user login/authentication. These are discussed as future enhancements in Section 10.</w:t>
+        <w:t>The project covers a fully functional expense-tracking app with transaction management, monthly browsing, charts, and budget tracking. The following are intentionally out of scope for this assignment: multi-user accounts, bank integration, and user login/authentication. These are discussed as future enhancements in Section 10.</w:t>
       </w:r>
     </w:p>
     <w:p>
@@ -1908,7 +1924,7 @@
               <w:rPr>
                 <w:sz w:val="20"/>
               </w:rPr>
-              <w:t>Remove a single record with a confirmation dialog, or clear all records from the Profile page.</w:t>
+              <w:t>Remove a single record from its Detail screen with a confirmation dialog.</w:t>
             </w:r>
           </w:p>
         </w:tc>
@@ -2503,7 +2519,7 @@
                 <w:color w:val="1A1A1A"/>
                 <w:sz w:val="17"/>
               </w:rPr>
-              <w:t xml:space="preserve">  |  Ledger | Charts | Discover | Profile | AddEdit |</w:t>
+              <w:t xml:space="preserve">  |      Ledger | Charts | Discover | AddEdit       |</w:t>
             </w:r>
           </w:p>
           <w:p>
@@ -2941,19 +2957,6 @@
                 <w:sz w:val="17"/>
               </w:rPr>
               <w:t xml:space="preserve">    discover_screen.dart        # Monthly bill + budget tracking</w:t>
-            </w:r>
-          </w:p>
-          <w:p>
-            <w:pPr>
-              <w:spacing w:after="0" w:line="240" w:lineRule="auto"/>
-            </w:pPr>
-            <w:r>
-              <w:rPr>
-                <w:rFonts w:ascii="Consolas" w:hAnsi="Consolas"/>
-                <w:color w:val="1A1A1A"/>
-                <w:sz w:val="17"/>
-              </w:rPr>
-              <w:t xml:space="preserve">    profile_screen.dart         # Stats, settings, clear-all</w:t>
             </w:r>
           </w:p>
           <w:p>
@@ -3744,7 +3747,7 @@
           <w:i w:val="0"/>
           <w:sz w:val="22"/>
         </w:rPr>
-        <w:t>The app uses a custom bottom navigation bar with four primary tabs — Ledger, Charts, Discover and Profile — plus a central circular “Record” button that opens the Add screen as a full-screen modal. An IndexedStack preserves the scroll position and state of each tab when the user switches between them. The Detail screen is pushed on top of the navigation stack with MaterialPageRoute.</w:t>
+        <w:t>The app uses a custom bottom navigation bar with four equal-width tabs — Ledger, Charts, Record and Discover. The Record tab opens the Add screen as a full-screen modal, while Ledger, Charts and Discover are pages held in an IndexedStack that preserves the scroll position and state of each tab when the user switches between them. The Detail screen is pushed on top of the navigation stack with MaterialPageRoute.</w:t>
       </w:r>
     </w:p>
     <w:p>
@@ -4157,60 +4160,45 @@
         <w:t>The Ledger is the landing screen. A yellow header shows a month selector and the selected month's total income and expense. Below it, transactions are grouped under date headers, each group rendered as a white rounded card. Tapping a row opens its Detail screen.</w:t>
       </w:r>
     </w:p>
-    <w:tbl>
-      <w:tblPr>
-        <w:tblW w:type="auto" w:w="0"/>
+    <w:p>
+      <w:pPr>
         <w:jc w:val="center"/>
-        <w:tblLook w:firstColumn="1" w:firstRow="1" w:lastColumn="0" w:lastRow="0" w:noHBand="0" w:noVBand="1" w:val="04A0"/>
-      </w:tblPr>
-      <w:tblGrid>
-        <w:gridCol w:w="9072"/>
-      </w:tblGrid>
-      <w:tr>
-        <w:trPr>
-          <w:trHeight w:val="3118" w:hRule="atLeast"/>
-        </w:trPr>
-        <w:tc>
-          <w:tcPr>
-            <w:tcW w:type="dxa" w:w="3969"/>
-            <w:shd w:val="clear" w:color="auto" w:fill="FAFAFA"/>
-            <w:tcBorders>
-              <w:top w:val="single" w:sz="8" w:space="0" w:color="BBBBBB"/>
-              <w:left w:val="single" w:sz="8" w:space="0" w:color="BBBBBB"/>
-              <w:bottom w:val="single" w:sz="8" w:space="0" w:color="BBBBBB"/>
-              <w:right w:val="single" w:sz="8" w:space="0" w:color="BBBBBB"/>
-            </w:tcBorders>
-            <w:vAlign w:val="center"/>
-          </w:tcPr>
-          <w:p>
-            <w:pPr>
-              <w:jc w:val="center"/>
-            </w:pPr>
-            <w:r>
-              <w:rPr>
-                <w:b/>
-                <w:color w:val="666666"/>
-                <w:sz w:val="22"/>
-              </w:rPr>
-              <w:t>🖼  Ledger Screen</w:t>
-            </w:r>
-          </w:p>
-          <w:p>
-            <w:pPr>
-              <w:jc w:val="center"/>
-            </w:pPr>
-            <w:r>
-              <w:rPr>
-                <w:i/>
-                <w:color w:val="AAAAAA"/>
-                <w:sz w:val="16"/>
-              </w:rPr>
-              <w:t>[ insert screenshot here ]</w:t>
-            </w:r>
-          </w:p>
-        </w:tc>
-      </w:tr>
-    </w:tbl>
+      </w:pPr>
+      <w:r>
+        <w:drawing>
+          <wp:inline xmlns:a="http://schemas.openxmlformats.org/drawingml/2006/main" xmlns:pic="http://schemas.openxmlformats.org/drawingml/2006/picture">
+            <wp:extent cx="1497156" cy="3240000"/>
+            <wp:docPr id="3" name="Picture 3"/>
+            <wp:cNvGraphicFramePr>
+              <a:graphicFrameLocks noChangeAspect="1"/>
+            </wp:cNvGraphicFramePr>
+            <a:graphic>
+              <a:graphicData uri="http://schemas.openxmlformats.org/drawingml/2006/picture">
+                <pic:pic>
+                  <pic:nvPicPr>
+                    <pic:cNvPr id="0" name="01_ledger.png"/>
+                    <pic:cNvPicPr/>
+                  </pic:nvPicPr>
+                  <pic:blipFill>
+                    <a:blip r:embed="rId10"/>
+                    <a:stretch>
+                      <a:fillRect/>
+                    </a:stretch>
+                  </pic:blipFill>
+                  <pic:spPr>
+                    <a:xfrm>
+                      <a:off x="0" y="0"/>
+                      <a:ext cx="1497156" cy="3240000"/>
+                    </a:xfrm>
+                    <a:prstGeom prst="rect"/>
+                  </pic:spPr>
+                </pic:pic>
+              </a:graphicData>
+            </a:graphic>
+          </wp:inline>
+        </w:drawing>
+      </w:r>
+    </w:p>
     <w:p>
       <w:pPr>
         <w:spacing w:after="200" w:before="40"/>
@@ -4244,63 +4232,48 @@
           <w:i w:val="0"/>
           <w:sz w:val="22"/>
         </w:rPr>
-        <w:t>Opened from the central Record button (or the edit icon on a Detail screen), this screen has an Expense/Income tab bar, a live amount display, a category grid, a date picker, a note field, and a custom numeric keypad with a Save key. In edit mode every field is pre-filled with the existing record.</w:t>
+        <w:t>Opened from the Record tab (or the edit icon on a Detail screen), this screen has an Expense/Income tab bar, a live amount display, a category grid, a date picker, a note field, and a custom numeric keypad with a Save key. In edit mode every field is pre-filled with the existing record.</w:t>
       </w:r>
     </w:p>
-    <w:tbl>
-      <w:tblPr>
-        <w:tblW w:type="auto" w:w="0"/>
+    <w:p>
+      <w:pPr>
         <w:jc w:val="center"/>
-        <w:tblLook w:firstColumn="1" w:firstRow="1" w:lastColumn="0" w:lastRow="0" w:noHBand="0" w:noVBand="1" w:val="04A0"/>
-      </w:tblPr>
-      <w:tblGrid>
-        <w:gridCol w:w="9072"/>
-      </w:tblGrid>
-      <w:tr>
-        <w:trPr>
-          <w:trHeight w:val="3118" w:hRule="atLeast"/>
-        </w:trPr>
-        <w:tc>
-          <w:tcPr>
-            <w:tcW w:type="dxa" w:w="3969"/>
-            <w:shd w:val="clear" w:color="auto" w:fill="FAFAFA"/>
-            <w:tcBorders>
-              <w:top w:val="single" w:sz="8" w:space="0" w:color="BBBBBB"/>
-              <w:left w:val="single" w:sz="8" w:space="0" w:color="BBBBBB"/>
-              <w:bottom w:val="single" w:sz="8" w:space="0" w:color="BBBBBB"/>
-              <w:right w:val="single" w:sz="8" w:space="0" w:color="BBBBBB"/>
-            </w:tcBorders>
-            <w:vAlign w:val="center"/>
-          </w:tcPr>
-          <w:p>
-            <w:pPr>
-              <w:jc w:val="center"/>
-            </w:pPr>
-            <w:r>
-              <w:rPr>
-                <w:b/>
-                <w:color w:val="666666"/>
-                <w:sz w:val="22"/>
-              </w:rPr>
-              <w:t>🖼  Add / Edit Record Screen</w:t>
-            </w:r>
-          </w:p>
-          <w:p>
-            <w:pPr>
-              <w:jc w:val="center"/>
-            </w:pPr>
-            <w:r>
-              <w:rPr>
-                <w:i/>
-                <w:color w:val="AAAAAA"/>
-                <w:sz w:val="16"/>
-              </w:rPr>
-              <w:t>[ insert screenshot here ]</w:t>
-            </w:r>
-          </w:p>
-        </w:tc>
-      </w:tr>
-    </w:tbl>
+      </w:pPr>
+      <w:r>
+        <w:drawing>
+          <wp:inline xmlns:a="http://schemas.openxmlformats.org/drawingml/2006/main" xmlns:pic="http://schemas.openxmlformats.org/drawingml/2006/picture">
+            <wp:extent cx="1497156" cy="3240000"/>
+            <wp:docPr id="4" name="Picture 4"/>
+            <wp:cNvGraphicFramePr>
+              <a:graphicFrameLocks noChangeAspect="1"/>
+            </wp:cNvGraphicFramePr>
+            <a:graphic>
+              <a:graphicData uri="http://schemas.openxmlformats.org/drawingml/2006/picture">
+                <pic:pic>
+                  <pic:nvPicPr>
+                    <pic:cNvPr id="0" name="02_add_record.png"/>
+                    <pic:cNvPicPr/>
+                  </pic:nvPicPr>
+                  <pic:blipFill>
+                    <a:blip r:embed="rId11"/>
+                    <a:stretch>
+                      <a:fillRect/>
+                    </a:stretch>
+                  </pic:blipFill>
+                  <pic:spPr>
+                    <a:xfrm>
+                      <a:off x="0" y="0"/>
+                      <a:ext cx="1497156" cy="3240000"/>
+                    </a:xfrm>
+                    <a:prstGeom prst="rect"/>
+                  </pic:spPr>
+                </pic:pic>
+              </a:graphicData>
+            </a:graphic>
+          </wp:inline>
+        </w:drawing>
+      </w:r>
+    </w:p>
     <w:p>
       <w:pPr>
         <w:spacing w:after="200" w:before="40"/>
@@ -4337,60 +4310,45 @@
         <w:t>The Detail screen presents a single transaction in full: a large amount card, the type, category, date, time and note, plus Edit and Delete actions in the app bar and a prominent Delete button.</w:t>
       </w:r>
     </w:p>
-    <w:tbl>
-      <w:tblPr>
-        <w:tblW w:type="auto" w:w="0"/>
+    <w:p>
+      <w:pPr>
         <w:jc w:val="center"/>
-        <w:tblLook w:firstColumn="1" w:firstRow="1" w:lastColumn="0" w:lastRow="0" w:noHBand="0" w:noVBand="1" w:val="04A0"/>
-      </w:tblPr>
-      <w:tblGrid>
-        <w:gridCol w:w="9072"/>
-      </w:tblGrid>
-      <w:tr>
-        <w:trPr>
-          <w:trHeight w:val="3118" w:hRule="atLeast"/>
-        </w:trPr>
-        <w:tc>
-          <w:tcPr>
-            <w:tcW w:type="dxa" w:w="3969"/>
-            <w:shd w:val="clear" w:color="auto" w:fill="FAFAFA"/>
-            <w:tcBorders>
-              <w:top w:val="single" w:sz="8" w:space="0" w:color="BBBBBB"/>
-              <w:left w:val="single" w:sz="8" w:space="0" w:color="BBBBBB"/>
-              <w:bottom w:val="single" w:sz="8" w:space="0" w:color="BBBBBB"/>
-              <w:right w:val="single" w:sz="8" w:space="0" w:color="BBBBBB"/>
-            </w:tcBorders>
-            <w:vAlign w:val="center"/>
-          </w:tcPr>
-          <w:p>
-            <w:pPr>
-              <w:jc w:val="center"/>
-            </w:pPr>
-            <w:r>
-              <w:rPr>
-                <w:b/>
-                <w:color w:val="666666"/>
-                <w:sz w:val="22"/>
-              </w:rPr>
-              <w:t>🖼  Detail Screen</w:t>
-            </w:r>
-          </w:p>
-          <w:p>
-            <w:pPr>
-              <w:jc w:val="center"/>
-            </w:pPr>
-            <w:r>
-              <w:rPr>
-                <w:i/>
-                <w:color w:val="AAAAAA"/>
-                <w:sz w:val="16"/>
-              </w:rPr>
-              <w:t>[ insert screenshot here ]</w:t>
-            </w:r>
-          </w:p>
-        </w:tc>
-      </w:tr>
-    </w:tbl>
+      </w:pPr>
+      <w:r>
+        <w:drawing>
+          <wp:inline xmlns:a="http://schemas.openxmlformats.org/drawingml/2006/main" xmlns:pic="http://schemas.openxmlformats.org/drawingml/2006/picture">
+            <wp:extent cx="1497156" cy="3240000"/>
+            <wp:docPr id="5" name="Picture 5"/>
+            <wp:cNvGraphicFramePr>
+              <a:graphicFrameLocks noChangeAspect="1"/>
+            </wp:cNvGraphicFramePr>
+            <a:graphic>
+              <a:graphicData uri="http://schemas.openxmlformats.org/drawingml/2006/picture">
+                <pic:pic>
+                  <pic:nvPicPr>
+                    <pic:cNvPr id="0" name="03_detail.png"/>
+                    <pic:cNvPicPr/>
+                  </pic:nvPicPr>
+                  <pic:blipFill>
+                    <a:blip r:embed="rId12"/>
+                    <a:stretch>
+                      <a:fillRect/>
+                    </a:stretch>
+                  </pic:blipFill>
+                  <pic:spPr>
+                    <a:xfrm>
+                      <a:off x="0" y="0"/>
+                      <a:ext cx="1497156" cy="3240000"/>
+                    </a:xfrm>
+                    <a:prstGeom prst="rect"/>
+                  </pic:spPr>
+                </pic:pic>
+              </a:graphicData>
+            </a:graphic>
+          </wp:inline>
+        </w:drawing>
+      </w:r>
+    </w:p>
     <w:p>
       <w:pPr>
         <w:spacing w:after="200" w:before="40"/>
@@ -4427,60 +4385,45 @@
         <w:t>Charts visualises spending. A Week/Month/Year toggle drives a custom-painted line chart (drawn with CustomPainter), and a category breakdown lists each category's total, percentage and a progress bar.</w:t>
       </w:r>
     </w:p>
-    <w:tbl>
-      <w:tblPr>
-        <w:tblW w:type="auto" w:w="0"/>
+    <w:p>
+      <w:pPr>
         <w:jc w:val="center"/>
-        <w:tblLook w:firstColumn="1" w:firstRow="1" w:lastColumn="0" w:lastRow="0" w:noHBand="0" w:noVBand="1" w:val="04A0"/>
-      </w:tblPr>
-      <w:tblGrid>
-        <w:gridCol w:w="9072"/>
-      </w:tblGrid>
-      <w:tr>
-        <w:trPr>
-          <w:trHeight w:val="3118" w:hRule="atLeast"/>
-        </w:trPr>
-        <w:tc>
-          <w:tcPr>
-            <w:tcW w:type="dxa" w:w="3969"/>
-            <w:shd w:val="clear" w:color="auto" w:fill="FAFAFA"/>
-            <w:tcBorders>
-              <w:top w:val="single" w:sz="8" w:space="0" w:color="BBBBBB"/>
-              <w:left w:val="single" w:sz="8" w:space="0" w:color="BBBBBB"/>
-              <w:bottom w:val="single" w:sz="8" w:space="0" w:color="BBBBBB"/>
-              <w:right w:val="single" w:sz="8" w:space="0" w:color="BBBBBB"/>
-            </w:tcBorders>
-            <w:vAlign w:val="center"/>
-          </w:tcPr>
-          <w:p>
-            <w:pPr>
-              <w:jc w:val="center"/>
-            </w:pPr>
-            <w:r>
-              <w:rPr>
-                <w:b/>
-                <w:color w:val="666666"/>
-                <w:sz w:val="22"/>
-              </w:rPr>
-              <w:t>🖼  Charts Screen</w:t>
-            </w:r>
-          </w:p>
-          <w:p>
-            <w:pPr>
-              <w:jc w:val="center"/>
-            </w:pPr>
-            <w:r>
-              <w:rPr>
-                <w:i/>
-                <w:color w:val="AAAAAA"/>
-                <w:sz w:val="16"/>
-              </w:rPr>
-              <w:t>[ insert screenshot here ]</w:t>
-            </w:r>
-          </w:p>
-        </w:tc>
-      </w:tr>
-    </w:tbl>
+      </w:pPr>
+      <w:r>
+        <w:drawing>
+          <wp:inline xmlns:a="http://schemas.openxmlformats.org/drawingml/2006/main" xmlns:pic="http://schemas.openxmlformats.org/drawingml/2006/picture">
+            <wp:extent cx="1497156" cy="3240000"/>
+            <wp:docPr id="6" name="Picture 6"/>
+            <wp:cNvGraphicFramePr>
+              <a:graphicFrameLocks noChangeAspect="1"/>
+            </wp:cNvGraphicFramePr>
+            <a:graphic>
+              <a:graphicData uri="http://schemas.openxmlformats.org/drawingml/2006/picture">
+                <pic:pic>
+                  <pic:nvPicPr>
+                    <pic:cNvPr id="0" name="04_charts.png"/>
+                    <pic:cNvPicPr/>
+                  </pic:nvPicPr>
+                  <pic:blipFill>
+                    <a:blip r:embed="rId13"/>
+                    <a:stretch>
+                      <a:fillRect/>
+                    </a:stretch>
+                  </pic:blipFill>
+                  <pic:spPr>
+                    <a:xfrm>
+                      <a:off x="0" y="0"/>
+                      <a:ext cx="1497156" cy="3240000"/>
+                    </a:xfrm>
+                    <a:prstGeom prst="rect"/>
+                  </pic:spPr>
+                </pic:pic>
+              </a:graphicData>
+            </a:graphic>
+          </wp:inline>
+        </w:drawing>
+      </w:r>
+    </w:p>
     <w:p>
       <w:pPr>
         <w:spacing w:after="200" w:before="40"/>
@@ -4501,7 +4444,7 @@
         <w:pStyle w:val="Heading3"/>
       </w:pPr>
       <w:r>
-        <w:t>4.3.5 Discover and Profile</w:t>
+        <w:t>4.3.5 Discover</w:t>
       </w:r>
     </w:p>
     <w:p>
@@ -4514,63 +4457,48 @@
           <w:i w:val="0"/>
           <w:sz w:val="22"/>
         </w:rPr>
-        <w:t>Discover shows the monthly bill and a budget card with a circular progress indicator. Profile shows lifetime statistics, a financial summary, settings, and a “Clear All Records” option.</w:t>
+        <w:t>Discover shows the monthly bill — income, expense and balance — and a budget card with a circular progress indicator, alongside quick statistics such as the total number of records and active days.</w:t>
       </w:r>
     </w:p>
-    <w:tbl>
-      <w:tblPr>
-        <w:tblW w:type="auto" w:w="0"/>
+    <w:p>
+      <w:pPr>
         <w:jc w:val="center"/>
-        <w:tblLook w:firstColumn="1" w:firstRow="1" w:lastColumn="0" w:lastRow="0" w:noHBand="0" w:noVBand="1" w:val="04A0"/>
-      </w:tblPr>
-      <w:tblGrid>
-        <w:gridCol w:w="9072"/>
-      </w:tblGrid>
-      <w:tr>
-        <w:trPr>
-          <w:trHeight w:val="3118" w:hRule="atLeast"/>
-        </w:trPr>
-        <w:tc>
-          <w:tcPr>
-            <w:tcW w:type="dxa" w:w="3969"/>
-            <w:shd w:val="clear" w:color="auto" w:fill="FAFAFA"/>
-            <w:tcBorders>
-              <w:top w:val="single" w:sz="8" w:space="0" w:color="BBBBBB"/>
-              <w:left w:val="single" w:sz="8" w:space="0" w:color="BBBBBB"/>
-              <w:bottom w:val="single" w:sz="8" w:space="0" w:color="BBBBBB"/>
-              <w:right w:val="single" w:sz="8" w:space="0" w:color="BBBBBB"/>
-            </w:tcBorders>
-            <w:vAlign w:val="center"/>
-          </w:tcPr>
-          <w:p>
-            <w:pPr>
-              <w:jc w:val="center"/>
-            </w:pPr>
-            <w:r>
-              <w:rPr>
-                <w:b/>
-                <w:color w:val="666666"/>
-                <w:sz w:val="22"/>
-              </w:rPr>
-              <w:t>🖼  Discover &amp; Profile Screens</w:t>
-            </w:r>
-          </w:p>
-          <w:p>
-            <w:pPr>
-              <w:jc w:val="center"/>
-            </w:pPr>
-            <w:r>
-              <w:rPr>
-                <w:i/>
-                <w:color w:val="AAAAAA"/>
-                <w:sz w:val="16"/>
-              </w:rPr>
-              <w:t>[ insert screenshot here ]</w:t>
-            </w:r>
-          </w:p>
-        </w:tc>
-      </w:tr>
-    </w:tbl>
+      </w:pPr>
+      <w:r>
+        <w:drawing>
+          <wp:inline xmlns:a="http://schemas.openxmlformats.org/drawingml/2006/main" xmlns:pic="http://schemas.openxmlformats.org/drawingml/2006/picture">
+            <wp:extent cx="1497156" cy="3240000"/>
+            <wp:docPr id="7" name="Picture 7"/>
+            <wp:cNvGraphicFramePr>
+              <a:graphicFrameLocks noChangeAspect="1"/>
+            </wp:cNvGraphicFramePr>
+            <a:graphic>
+              <a:graphicData uri="http://schemas.openxmlformats.org/drawingml/2006/picture">
+                <pic:pic>
+                  <pic:nvPicPr>
+                    <pic:cNvPr id="0" name="05_discover.png"/>
+                    <pic:cNvPicPr/>
+                  </pic:nvPicPr>
+                  <pic:blipFill>
+                    <a:blip r:embed="rId14"/>
+                    <a:stretch>
+                      <a:fillRect/>
+                    </a:stretch>
+                  </pic:blipFill>
+                  <pic:spPr>
+                    <a:xfrm>
+                      <a:off x="0" y="0"/>
+                      <a:ext cx="1497156" cy="3240000"/>
+                    </a:xfrm>
+                    <a:prstGeom prst="rect"/>
+                  </pic:spPr>
+                </pic:pic>
+              </a:graphicData>
+            </a:graphic>
+          </wp:inline>
+        </w:drawing>
+      </w:r>
+    </w:p>
     <w:p>
       <w:pPr>
         <w:spacing w:after="200" w:before="40"/>
@@ -4583,7 +4511,7 @@
           <w:color w:val="666666"/>
           <w:sz w:val="18"/>
         </w:rPr>
-        <w:t>Figure 8: Budget tracking and statistics.</w:t>
+        <w:t>Figure 8: Monthly bill and budget tracking.</w:t>
       </w:r>
     </w:p>
     <w:p>
@@ -7153,7 +7081,7 @@
               <w:rPr>
                 <w:sz w:val="20"/>
               </w:rPr>
-              <w:t>Discover (budget) and Profile screens; Firebase/Firestore wiring; automated tests.</w:t>
+              <w:t>Discover screen (monthly bill and budget); Firebase/Firestore wiring; automated tests.</w:t>
             </w:r>
           </w:p>
         </w:tc>
@@ -7649,8 +7577,8 @@
       </w:tblGrid>
       <w:tr>
         <w:trPr>
-          <w:trHeight w:val="2835" w:hRule="atLeast"/>
-          <w:trHeight w:val="2835" w:hRule="atLeast"/>
+          <w:trHeight w:val="4819" w:hRule="atLeast"/>
+          <w:trHeight w:val="4819" w:hRule="atLeast"/>
         </w:trPr>
         <w:tc>
           <w:tcPr>
@@ -7680,12 +7608,38 @@
               <w:jc w:val="center"/>
             </w:pPr>
             <w:r>
-              <w:rPr>
-                <w:i/>
-                <w:color w:val="AAAAAA"/>
-                <w:sz w:val="16"/>
-              </w:rPr>
-              <w:t>[ insert screenshot ]</w:t>
+              <w:drawing>
+                <wp:inline xmlns:a="http://schemas.openxmlformats.org/drawingml/2006/main" xmlns:pic="http://schemas.openxmlformats.org/drawingml/2006/picture">
+                  <wp:extent cx="1330806" cy="2880000"/>
+                  <wp:docPr id="8" name="Picture 8"/>
+                  <wp:cNvGraphicFramePr>
+                    <a:graphicFrameLocks noChangeAspect="1"/>
+                  </wp:cNvGraphicFramePr>
+                  <a:graphic>
+                    <a:graphicData uri="http://schemas.openxmlformats.org/drawingml/2006/picture">
+                      <pic:pic>
+                        <pic:nvPicPr>
+                          <pic:cNvPr id="0" name="01_ledger.png"/>
+                          <pic:cNvPicPr/>
+                        </pic:nvPicPr>
+                        <pic:blipFill>
+                          <a:blip r:embed="rId10"/>
+                          <a:stretch>
+                            <a:fillRect/>
+                          </a:stretch>
+                        </pic:blipFill>
+                        <pic:spPr>
+                          <a:xfrm>
+                            <a:off x="0" y="0"/>
+                            <a:ext cx="1330806" cy="2880000"/>
+                          </a:xfrm>
+                          <a:prstGeom prst="rect"/>
+                        </pic:spPr>
+                      </pic:pic>
+                    </a:graphicData>
+                  </a:graphic>
+                </wp:inline>
+              </w:drawing>
             </w:r>
           </w:p>
           <w:p>
@@ -7730,12 +7684,38 @@
               <w:jc w:val="center"/>
             </w:pPr>
             <w:r>
-              <w:rPr>
-                <w:i/>
-                <w:color w:val="AAAAAA"/>
-                <w:sz w:val="16"/>
-              </w:rPr>
-              <w:t>[ insert screenshot ]</w:t>
+              <w:drawing>
+                <wp:inline xmlns:a="http://schemas.openxmlformats.org/drawingml/2006/main" xmlns:pic="http://schemas.openxmlformats.org/drawingml/2006/picture">
+                  <wp:extent cx="1330806" cy="2880000"/>
+                  <wp:docPr id="9" name="Picture 9"/>
+                  <wp:cNvGraphicFramePr>
+                    <a:graphicFrameLocks noChangeAspect="1"/>
+                  </wp:cNvGraphicFramePr>
+                  <a:graphic>
+                    <a:graphicData uri="http://schemas.openxmlformats.org/drawingml/2006/picture">
+                      <pic:pic>
+                        <pic:nvPicPr>
+                          <pic:cNvPr id="0" name="02_add_record.png"/>
+                          <pic:cNvPicPr/>
+                        </pic:nvPicPr>
+                        <pic:blipFill>
+                          <a:blip r:embed="rId11"/>
+                          <a:stretch>
+                            <a:fillRect/>
+                          </a:stretch>
+                        </pic:blipFill>
+                        <pic:spPr>
+                          <a:xfrm>
+                            <a:off x="0" y="0"/>
+                            <a:ext cx="1330806" cy="2880000"/>
+                          </a:xfrm>
+                          <a:prstGeom prst="rect"/>
+                        </pic:spPr>
+                      </pic:pic>
+                    </a:graphicData>
+                  </a:graphic>
+                </wp:inline>
+              </w:drawing>
             </w:r>
           </w:p>
           <w:p>
@@ -7755,8 +7735,8 @@
       </w:tr>
       <w:tr>
         <w:trPr>
-          <w:trHeight w:val="2835" w:hRule="atLeast"/>
-          <w:trHeight w:val="2835" w:hRule="atLeast"/>
+          <w:trHeight w:val="4819" w:hRule="atLeast"/>
+          <w:trHeight w:val="4819" w:hRule="atLeast"/>
         </w:trPr>
         <w:tc>
           <w:tcPr>
@@ -7786,12 +7766,38 @@
               <w:jc w:val="center"/>
             </w:pPr>
             <w:r>
-              <w:rPr>
-                <w:i/>
-                <w:color w:val="AAAAAA"/>
-                <w:sz w:val="16"/>
-              </w:rPr>
-              <w:t>[ insert screenshot ]</w:t>
+              <w:drawing>
+                <wp:inline xmlns:a="http://schemas.openxmlformats.org/drawingml/2006/main" xmlns:pic="http://schemas.openxmlformats.org/drawingml/2006/picture">
+                  <wp:extent cx="1330806" cy="2880000"/>
+                  <wp:docPr id="10" name="Picture 10"/>
+                  <wp:cNvGraphicFramePr>
+                    <a:graphicFrameLocks noChangeAspect="1"/>
+                  </wp:cNvGraphicFramePr>
+                  <a:graphic>
+                    <a:graphicData uri="http://schemas.openxmlformats.org/drawingml/2006/picture">
+                      <pic:pic>
+                        <pic:nvPicPr>
+                          <pic:cNvPr id="0" name="03_detail.png"/>
+                          <pic:cNvPicPr/>
+                        </pic:nvPicPr>
+                        <pic:blipFill>
+                          <a:blip r:embed="rId12"/>
+                          <a:stretch>
+                            <a:fillRect/>
+                          </a:stretch>
+                        </pic:blipFill>
+                        <pic:spPr>
+                          <a:xfrm>
+                            <a:off x="0" y="0"/>
+                            <a:ext cx="1330806" cy="2880000"/>
+                          </a:xfrm>
+                          <a:prstGeom prst="rect"/>
+                        </pic:spPr>
+                      </pic:pic>
+                    </a:graphicData>
+                  </a:graphic>
+                </wp:inline>
+              </w:drawing>
             </w:r>
           </w:p>
           <w:p>
@@ -7836,12 +7842,38 @@
               <w:jc w:val="center"/>
             </w:pPr>
             <w:r>
-              <w:rPr>
-                <w:i/>
-                <w:color w:val="AAAAAA"/>
-                <w:sz w:val="16"/>
-              </w:rPr>
-              <w:t>[ insert screenshot ]</w:t>
+              <w:drawing>
+                <wp:inline xmlns:a="http://schemas.openxmlformats.org/drawingml/2006/main" xmlns:pic="http://schemas.openxmlformats.org/drawingml/2006/picture">
+                  <wp:extent cx="1330806" cy="2880000"/>
+                  <wp:docPr id="11" name="Picture 11"/>
+                  <wp:cNvGraphicFramePr>
+                    <a:graphicFrameLocks noChangeAspect="1"/>
+                  </wp:cNvGraphicFramePr>
+                  <a:graphic>
+                    <a:graphicData uri="http://schemas.openxmlformats.org/drawingml/2006/picture">
+                      <pic:pic>
+                        <pic:nvPicPr>
+                          <pic:cNvPr id="0" name="04_charts.png"/>
+                          <pic:cNvPicPr/>
+                        </pic:nvPicPr>
+                        <pic:blipFill>
+                          <a:blip r:embed="rId13"/>
+                          <a:stretch>
+                            <a:fillRect/>
+                          </a:stretch>
+                        </pic:blipFill>
+                        <pic:spPr>
+                          <a:xfrm>
+                            <a:off x="0" y="0"/>
+                            <a:ext cx="1330806" cy="2880000"/>
+                          </a:xfrm>
+                          <a:prstGeom prst="rect"/>
+                        </pic:spPr>
+                      </pic:pic>
+                    </a:graphicData>
+                  </a:graphic>
+                </wp:inline>
+              </w:drawing>
             </w:r>
           </w:p>
           <w:p>
@@ -7861,8 +7893,7 @@
       </w:tr>
       <w:tr>
         <w:trPr>
-          <w:trHeight w:val="2835" w:hRule="atLeast"/>
-          <w:trHeight w:val="2835" w:hRule="atLeast"/>
+          <w:trHeight w:val="4819" w:hRule="atLeast"/>
         </w:trPr>
         <w:tc>
           <w:tcPr>
@@ -7892,12 +7923,38 @@
               <w:jc w:val="center"/>
             </w:pPr>
             <w:r>
-              <w:rPr>
-                <w:i/>
-                <w:color w:val="AAAAAA"/>
-                <w:sz w:val="16"/>
-              </w:rPr>
-              <w:t>[ insert screenshot ]</w:t>
+              <w:drawing>
+                <wp:inline xmlns:a="http://schemas.openxmlformats.org/drawingml/2006/main" xmlns:pic="http://schemas.openxmlformats.org/drawingml/2006/picture">
+                  <wp:extent cx="1330806" cy="2880000"/>
+                  <wp:docPr id="12" name="Picture 12"/>
+                  <wp:cNvGraphicFramePr>
+                    <a:graphicFrameLocks noChangeAspect="1"/>
+                  </wp:cNvGraphicFramePr>
+                  <a:graphic>
+                    <a:graphicData uri="http://schemas.openxmlformats.org/drawingml/2006/picture">
+                      <pic:pic>
+                        <pic:nvPicPr>
+                          <pic:cNvPr id="0" name="05_discover.png"/>
+                          <pic:cNvPicPr/>
+                        </pic:nvPicPr>
+                        <pic:blipFill>
+                          <a:blip r:embed="rId14"/>
+                          <a:stretch>
+                            <a:fillRect/>
+                          </a:stretch>
+                        </pic:blipFill>
+                        <pic:spPr>
+                          <a:xfrm>
+                            <a:off x="0" y="0"/>
+                            <a:ext cx="1330806" cy="2880000"/>
+                          </a:xfrm>
+                          <a:prstGeom prst="rect"/>
+                        </pic:spPr>
+                      </pic:pic>
+                    </a:graphicData>
+                  </a:graphic>
+                </wp:inline>
+              </w:drawing>
             </w:r>
           </w:p>
           <w:p>
@@ -7916,58 +7973,14 @@
         </w:tc>
         <w:tc>
           <w:tcPr>
-            <w:tcW w:type="dxa" w:w="4535"/>
-            <w:shd w:val="clear" w:color="auto" w:fill="FAFAFA"/>
-            <w:tcBorders>
-              <w:top w:val="single" w:sz="8" w:space="0" w:color="BBBBBB"/>
-              <w:left w:val="single" w:sz="8" w:space="0" w:color="BBBBBB"/>
-              <w:bottom w:val="single" w:sz="8" w:space="0" w:color="BBBBBB"/>
-              <w:right w:val="single" w:sz="8" w:space="0" w:color="BBBBBB"/>
-            </w:tcBorders>
+            <w:tcW w:type="dxa" w:w="4536"/>
           </w:tcPr>
-          <w:p>
-            <w:pPr>
-              <w:jc w:val="center"/>
-            </w:pPr>
-            <w:r>
-              <w:rPr>
-                <w:b/>
-                <w:color w:val="666666"/>
-              </w:rPr>
-              <w:t>🖼  Profile</w:t>
-            </w:r>
-          </w:p>
-          <w:p>
-            <w:pPr>
-              <w:jc w:val="center"/>
-            </w:pPr>
-            <w:r>
-              <w:rPr>
-                <w:i/>
-                <w:color w:val="AAAAAA"/>
-                <w:sz w:val="16"/>
-              </w:rPr>
-              <w:t>[ insert screenshot ]</w:t>
-            </w:r>
-          </w:p>
-          <w:p>
-            <w:pPr>
-              <w:jc w:val="center"/>
-            </w:pPr>
-            <w:r>
-              <w:rPr>
-                <w:i/>
-                <w:color w:val="666666"/>
-                <w:sz w:val="18"/>
-              </w:rPr>
-              <w:t>Statistics, summary and settings.</w:t>
-            </w:r>
-          </w:p>
+          <w:p/>
         </w:tc>
       </w:tr>
     </w:tbl>
     <w:sectPr>
-      <w:footerReference w:type="default" r:id="rId9"/>
+      <w:footerReference w:type="default" r:id="rId15"/>
       <w:pgSz w:w="11906" w:h="16838"/>
       <w:pgMar w:top="1361" w:right="1417" w:bottom="1361" w:left="1417" w:header="720" w:footer="720" w:gutter="0"/>
       <w:cols w:space="720"/>

</xml_diff>